<commit_message>
Fichas P1, P3, P4: comparaciones concretas en tablas
Co-Authored-By: Claude Opus 5.5 <noreply@anthropic.com>
Claude-Session: https://claude.ai/code/session_01GdrGkTkQ1SpY6BWmf3EBwF
</commit_message>
<xml_diff>
--- a/fichas/fai-pendulo-simple.docx
+++ b/fichas/fai-pendulo-simple.docx
@@ -43,7 +43,7 @@
         <w:jc w:val="both"/>
       </w:pPr>
       <w:r>
-        <w:t xml:space="preserve">Medir el periodo de un péndulo simple en función de su longitud para obtener la aceleración de la gravedad</w:t>
+        <w:t xml:space="preserve">Medir el periodo de un péndulo simple para varias longitudes y obtener de ellas la aceleración de la gravedad</w:t>
       </w:r>
       <w:r>
         <w:t xml:space="preserve"> </w:t>
@@ -54,7 +54,7 @@
         </m:r>
       </m:oMath>
       <w:r>
-        <w:t xml:space="preserve">, y estudiar cómo aumenta el periodo cuando la amplitud deja de ser pequeña.</w:t>
+        <w:t xml:space="preserve">. Comprobar después que, cuando la amplitud deja de ser pequeña, el periodo aumenta.</w:t>
       </w:r>
     </w:p>
     <w:bookmarkEnd w:id="21"/>
@@ -82,21 +82,7 @@
         <w:jc w:val="both"/>
       </w:pPr>
       <w:r>
-        <w:t xml:space="preserve">Un péndulo simple es una masa puntual</w:t>
-      </w:r>
-      <w:r>
-        <w:t xml:space="preserve"> </w:t>
-      </w:r>
-      <m:oMath>
-        <m:r>
-          <m:t>m</m:t>
-        </m:r>
-      </m:oMath>
-      <w:r>
-        <w:t xml:space="preserve"> </w:t>
-      </w:r>
-      <w:r>
-        <w:t xml:space="preserve">colgada de un hilo inextensible de longitud</w:t>
+        <w:t xml:space="preserve">Un péndulo simple es una masa colgada de un hilo de longitud</w:t>
       </w:r>
       <w:r>
         <w:t xml:space="preserve"> </w:t>
@@ -200,7 +186,7 @@
         <w:jc w:val="both"/>
       </w:pPr>
       <w:r>
-        <w:t xml:space="preserve">Para amplitudes pequeñas,</w:t>
+        <w:t xml:space="preserve">Para oscilaciones pequeñas,</w:t>
       </w:r>
       <w:r>
         <w:t xml:space="preserve"> </w:t>
@@ -229,7 +215,103 @@
         <w:t xml:space="preserve"> </w:t>
       </w:r>
       <w:r>
-        <w:t xml:space="preserve">y el movimiento es armónico simple con periodo</w:t>
+        <w:t xml:space="preserve">y la ecuación es la del movimiento armónico simple,</w:t>
+      </w:r>
+      <w:r>
+        <w:t xml:space="preserve"> </w:t>
+      </w:r>
+      <m:oMath>
+        <m:acc>
+          <m:accPr>
+            <m:chr m:val="̈"/>
+          </m:accPr>
+          <m:e>
+            <m:r>
+              <m:t>θ</m:t>
+            </m:r>
+          </m:e>
+        </m:acc>
+        <m:r>
+          <m:rPr>
+            <m:sty m:val="p"/>
+          </m:rPr>
+          <m:t>+</m:t>
+        </m:r>
+        <m:sSubSup>
+          <m:e>
+            <m:r>
+              <m:t>ω</m:t>
+            </m:r>
+          </m:e>
+          <m:sub>
+            <m:r>
+              <m:t>0</m:t>
+            </m:r>
+          </m:sub>
+          <m:sup>
+            <m:r>
+              <m:t>2</m:t>
+            </m:r>
+          </m:sup>
+        </m:sSubSup>
+        <m:r>
+          <m:t>θ</m:t>
+        </m:r>
+        <m:r>
+          <m:rPr>
+            <m:sty m:val="p"/>
+          </m:rPr>
+          <m:t>=</m:t>
+        </m:r>
+        <m:r>
+          <m:t>0</m:t>
+        </m:r>
+      </m:oMath>
+      <w:r>
+        <w:t xml:space="preserve">, con</w:t>
+      </w:r>
+      <w:r>
+        <w:t xml:space="preserve"> </w:t>
+      </w:r>
+      <m:oMath>
+        <m:sSubSup>
+          <m:e>
+            <m:r>
+              <m:t>ω</m:t>
+            </m:r>
+          </m:e>
+          <m:sub>
+            <m:r>
+              <m:t>0</m:t>
+            </m:r>
+          </m:sub>
+          <m:sup>
+            <m:r>
+              <m:t>2</m:t>
+            </m:r>
+          </m:sup>
+        </m:sSubSup>
+        <m:r>
+          <m:rPr>
+            <m:sty m:val="p"/>
+          </m:rPr>
+          <m:t>=</m:t>
+        </m:r>
+        <m:r>
+          <m:t>g</m:t>
+        </m:r>
+        <m:r>
+          <m:rPr>
+            <m:sty m:val="p"/>
+          </m:rPr>
+          <m:t>/</m:t>
+        </m:r>
+        <m:r>
+          <m:t>L</m:t>
+        </m:r>
+      </m:oMath>
+      <w:r>
+        <w:t xml:space="preserve">. El periodo es</w:t>
       </w:r>
     </w:p>
     <w:p>
@@ -291,17 +373,35 @@
             </m:e>
           </m:rad>
           <m:r>
-            <m:t>  </m:t>
-          </m:r>
-          <m:r>
             <m:rPr>
               <m:sty m:val="p"/>
             </m:rPr>
-            <m:t>⇒</m:t>
+            <m:t>,</m:t>
           </m:r>
-          <m:r>
-            <m:t>  </m:t>
-          </m:r>
+        </m:oMath>
+      </m:oMathPara>
+    </w:p>
+    <w:p>
+      <w:pPr>
+        <w:pStyle w:val="FirstParagraph"/>
+        <w:spacing w:after="120" w:line="276" w:lineRule="auto"/>
+        <w:jc w:val="both"/>
+      </w:pPr>
+      <w:r>
+        <w:t xml:space="preserve">que no depende de la amplitud ni de la masa. Elevando al cuadrado,</w:t>
+      </w:r>
+    </w:p>
+    <w:p>
+      <w:pPr>
+        <w:pStyle w:val="BodyText"/>
+        <w:spacing w:after="120" w:line="276" w:lineRule="auto"/>
+        <w:jc w:val="both"/>
+      </w:pPr>
+      <m:oMathPara>
+        <m:oMathParaPr>
+          <m:jc m:val="center"/>
+        </m:oMathParaPr>
+        <m:oMath>
           <m:sSubSup>
             <m:e>
               <m:r>
@@ -362,7 +462,7 @@
             <m:rPr>
               <m:sty m:val="p"/>
             </m:rPr>
-            <m:t>.</m:t>
+            <m:t>,</m:t>
           </m:r>
         </m:oMath>
       </m:oMathPara>
@@ -374,7 +474,102 @@
         <w:jc w:val="both"/>
       </w:pPr>
       <w:r>
-        <w:t xml:space="preserve">Si la amplitud angular</w:t>
+        <w:t xml:space="preserve">de modo que al representar</w:t>
+      </w:r>
+      <w:r>
+        <w:t xml:space="preserve"> </w:t>
+      </w:r>
+      <m:oMath>
+        <m:sSubSup>
+          <m:e>
+            <m:r>
+              <m:t>T</m:t>
+            </m:r>
+          </m:e>
+          <m:sub>
+            <m:r>
+              <m:t>0</m:t>
+            </m:r>
+          </m:sub>
+          <m:sup>
+            <m:r>
+              <m:t>2</m:t>
+            </m:r>
+          </m:sup>
+        </m:sSubSup>
+      </m:oMath>
+      <w:r>
+        <w:t xml:space="preserve"> </w:t>
+      </w:r>
+      <w:r>
+        <w:t xml:space="preserve">frente a</w:t>
+      </w:r>
+      <w:r>
+        <w:t xml:space="preserve"> </w:t>
+      </w:r>
+      <m:oMath>
+        <m:r>
+          <m:t>L</m:t>
+        </m:r>
+      </m:oMath>
+      <w:r>
+        <w:t xml:space="preserve"> </w:t>
+      </w:r>
+      <w:r>
+        <w:t xml:space="preserve">se obtiene una recta de pendiente</w:t>
+      </w:r>
+      <w:r>
+        <w:t xml:space="preserve"> </w:t>
+      </w:r>
+      <m:oMath>
+        <m:r>
+          <m:t>4</m:t>
+        </m:r>
+        <m:sSup>
+          <m:e>
+            <m:r>
+              <m:t>π</m:t>
+            </m:r>
+          </m:e>
+          <m:sup>
+            <m:r>
+              <m:t>2</m:t>
+            </m:r>
+          </m:sup>
+        </m:sSup>
+        <m:r>
+          <m:rPr>
+            <m:sty m:val="p"/>
+          </m:rPr>
+          <m:t>/</m:t>
+        </m:r>
+        <m:r>
+          <m:t>g</m:t>
+        </m:r>
+      </m:oMath>
+      <w:r>
+        <w:t xml:space="preserve">, y de ella se despeja</w:t>
+      </w:r>
+      <w:r>
+        <w:t xml:space="preserve"> </w:t>
+      </w:r>
+      <m:oMath>
+        <m:r>
+          <m:t>g</m:t>
+        </m:r>
+      </m:oMath>
+      <w:r>
+        <w:t xml:space="preserve">.</w:t>
+      </w:r>
+    </w:p>
+    <w:p>
+      <w:pPr>
+        <w:pStyle w:val="BodyText"/>
+        <w:spacing w:after="120" w:line="276" w:lineRule="auto"/>
+        <w:jc w:val="both"/>
+      </w:pPr>
+      <w:r>
+        <w:t xml:space="preserve">Si la amplitud</w:t>
       </w:r>
       <w:r>
         <w:t xml:space="preserve"> </w:t>
@@ -397,7 +592,50 @@
         <w:t xml:space="preserve"> </w:t>
       </w:r>
       <w:r>
-        <w:t xml:space="preserve">no es pequeña, el péndulo se comporta como un oscilador no armónico (muelle blando) y su periodo crece con la amplitud. Para amplitudes moderadas</w:t>
+        <w:t xml:space="preserve">no es pequeña, la aproximación</w:t>
+      </w:r>
+      <w:r>
+        <w:t xml:space="preserve"> </w:t>
+      </w:r>
+      <m:oMath>
+        <m:r>
+          <m:rPr>
+            <m:sty m:val="p"/>
+          </m:rPr>
+          <m:t>sin</m:t>
+        </m:r>
+        <m:r>
+          <m:t>θ</m:t>
+        </m:r>
+        <m:r>
+          <m:rPr>
+            <m:sty m:val="p"/>
+          </m:rPr>
+          <m:t>≃</m:t>
+        </m:r>
+        <m:r>
+          <m:t>θ</m:t>
+        </m:r>
+      </m:oMath>
+      <w:r>
+        <w:t xml:space="preserve"> </w:t>
+      </w:r>
+      <w:r>
+        <w:t xml:space="preserve">deja de valer y el periodo</w:t>
+      </w:r>
+      <w:r>
+        <w:t xml:space="preserve"> </w:t>
+      </w:r>
+      <m:oMath>
+        <m:r>
+          <m:t>T</m:t>
+        </m:r>
+      </m:oMath>
+      <w:r>
+        <w:t xml:space="preserve"> </w:t>
+      </w:r>
+      <w:r>
+        <w:t xml:space="preserve">crece con la amplitud. Para amplitudes moderadas,</w:t>
       </w:r>
     </w:p>
     <w:p>
@@ -455,54 +693,7 @@
               <m:type m:val="bar"/>
             </m:fPr>
             <m:num>
-              <m:r>
-                <m:t>1</m:t>
-              </m:r>
-            </m:num>
-            <m:den>
-              <m:r>
-                <m:t>16</m:t>
-              </m:r>
-            </m:den>
-          </m:f>
-          <m:r>
-            <m:t> </m:t>
-          </m:r>
-          <m:sSubSup>
-            <m:e>
-              <m:r>
-                <m:t>θ</m:t>
-              </m:r>
-            </m:e>
-            <m:sub>
-              <m:r>
-                <m:t>0</m:t>
-              </m:r>
-            </m:sub>
-            <m:sup>
-              <m:r>
-                <m:t>2</m:t>
-              </m:r>
-            </m:sup>
-          </m:sSubSup>
-          <m:r>
-            <m:rPr>
-              <m:sty m:val="p"/>
-            </m:rPr>
-            <m:t>,</m:t>
-          </m:r>
-          <m:r>
-            <m:t>  </m:t>
-          </m:r>
-          <m:d>
-            <m:dPr>
-              <m:begChr m:val="("/>
-              <m:endChr m:val=")"/>
-              <m:sepChr m:val=""/>
-              <m:grow/>
-            </m:dPr>
-            <m:e>
-              <m:sSub>
+              <m:sSubSup>
                 <m:e>
                   <m:r>
                     <m:t>θ</m:t>
@@ -513,24 +704,24 @@
                     <m:t>0</m:t>
                   </m:r>
                 </m:sub>
-              </m:sSub>
+                <m:sup>
+                  <m:r>
+                    <m:t>2</m:t>
+                  </m:r>
+                </m:sup>
+              </m:sSubSup>
+            </m:num>
+            <m:den>
               <m:r>
-                <m:t> </m:t>
+                <m:t>16</m:t>
               </m:r>
-              <m:r>
-                <m:rPr>
-                  <m:nor/>
-                  <m:sty m:val="p"/>
-                </m:rPr>
-                <m:t>en radianes</m:t>
-              </m:r>
-            </m:e>
-          </m:d>
+            </m:den>
+          </m:f>
           <m:r>
             <m:rPr>
               <m:sty m:val="p"/>
             </m:rPr>
-            <m:t>.</m:t>
+            <m:t>,</m:t>
           </m:r>
         </m:oMath>
       </m:oMathPara>
@@ -542,92 +733,89 @@
         <w:jc w:val="both"/>
       </w:pPr>
       <w:r>
-        <w:t xml:space="preserve">Como no disponemos de transportador, la amplitud se obtiene midiendo el triángulo de la Figura 1: la longitud</w:t>
+        <w:t xml:space="preserve">con</w:t>
       </w:r>
       <w:r>
         <w:t xml:space="preserve"> </w:t>
       </w:r>
       <m:oMath>
+        <m:sSub>
+          <m:e>
+            <m:r>
+              <m:t>θ</m:t>
+            </m:r>
+          </m:e>
+          <m:sub>
+            <m:r>
+              <m:t>0</m:t>
+            </m:r>
+          </m:sub>
+        </m:sSub>
+      </m:oMath>
+      <w:r>
+        <w:t xml:space="preserve"> </w:t>
+      </w:r>
+      <w:r>
+        <w:t xml:space="preserve">en radianes. La amplitud se obtiene del triángulo de la Figura 1, midiendo la distancia horizontal</w:t>
+      </w:r>
+      <w:r>
+        <w:t xml:space="preserve"> </w:t>
+      </w:r>
+      <m:oMath>
+        <m:r>
+          <m:t>x</m:t>
+        </m:r>
+      </m:oMath>
+      <w:r>
+        <w:t xml:space="preserve"> </w:t>
+      </w:r>
+      <w:r>
+        <w:t xml:space="preserve">entre la posición de reposo de la esfera y su posición de partida:</w:t>
+      </w:r>
+      <w:r>
+        <w:t xml:space="preserve"> </w:t>
+      </w:r>
+      <m:oMath>
+        <m:r>
+          <m:rPr>
+            <m:sty m:val="p"/>
+          </m:rPr>
+          <m:t>sin</m:t>
+        </m:r>
+        <m:sSub>
+          <m:e>
+            <m:r>
+              <m:t>θ</m:t>
+            </m:r>
+          </m:e>
+          <m:sub>
+            <m:r>
+              <m:t>0</m:t>
+            </m:r>
+          </m:sub>
+        </m:sSub>
+        <m:r>
+          <m:rPr>
+            <m:sty m:val="p"/>
+          </m:rPr>
+          <m:t>=</m:t>
+        </m:r>
+        <m:r>
+          <m:t>x</m:t>
+        </m:r>
+        <m:r>
+          <m:rPr>
+            <m:sty m:val="p"/>
+          </m:rPr>
+          <m:t>/</m:t>
+        </m:r>
         <m:r>
           <m:t>L</m:t>
         </m:r>
       </m:oMath>
       <w:r>
-        <w:t xml:space="preserve"> </w:t>
-      </w:r>
-      <w:r>
-        <w:t xml:space="preserve">y el cateto horizontal</w:t>
-      </w:r>
-      <w:r>
-        <w:t xml:space="preserve"> </w:t>
-      </w:r>
-      <m:oMath>
-        <m:r>
-          <m:t>x</m:t>
-        </m:r>
-      </m:oMath>
-      <w:r>
-        <w:t xml:space="preserve">, distancia horizontal entre la vertical del punto de suspensión y el centro de la esfera en la posición de partida:</w:t>
-      </w:r>
-    </w:p>
-    <w:p>
-      <w:pPr>
-        <w:pStyle w:val="BodyText"/>
-        <w:spacing w:after="120" w:line="276" w:lineRule="auto"/>
-        <w:jc w:val="both"/>
-      </w:pPr>
-      <m:oMathPara>
-        <m:oMathParaPr>
-          <m:jc m:val="center"/>
-        </m:oMathParaPr>
-        <m:oMath>
-          <m:sSub>
-            <m:e>
-              <m:r>
-                <m:t>θ</m:t>
-              </m:r>
-            </m:e>
-            <m:sub>
-              <m:r>
-                <m:t>0</m:t>
-              </m:r>
-            </m:sub>
-          </m:sSub>
-          <m:r>
-            <m:rPr>
-              <m:sty m:val="p"/>
-            </m:rPr>
-            <m:t>=</m:t>
-          </m:r>
-          <m:r>
-            <m:rPr>
-              <m:sty m:val="p"/>
-            </m:rPr>
-            <m:t>arcsin</m:t>
-          </m:r>
-          <m:f>
-            <m:fPr>
-              <m:type m:val="bar"/>
-            </m:fPr>
-            <m:num>
-              <m:r>
-                <m:t>x</m:t>
-              </m:r>
-            </m:num>
-            <m:den>
-              <m:r>
-                <m:t>L</m:t>
-              </m:r>
-            </m:den>
-          </m:f>
-          <m:r>
-            <m:rPr>
-              <m:sty m:val="p"/>
-            </m:rPr>
-            <m:t>.</m:t>
-          </m:r>
-        </m:oMath>
-      </m:oMathPara>
+        <w:t xml:space="preserve">.</w:t>
+      </w:r>
     </w:p>
     <w:bookmarkEnd w:id="22"/>
     <w:bookmarkStart w:id="26" w:name="montaje-experimental"/>
@@ -711,7 +899,7 @@
         <w:jc w:val="both"/>
       </w:pPr>
       <w:r>
-        <w:t xml:space="preserve">La esfera metálica se sujeta al hilo, que se fija al portaplacas. La longitud</w:t>
+        <w:t xml:space="preserve">La esfera se cuelga del hilo, que se fija al soporte. La longitud</w:t>
       </w:r>
       <w:r>
         <w:t xml:space="preserve"> </w:t>
@@ -725,7 +913,7 @@
         <w:t xml:space="preserve"> </w:t>
       </w:r>
       <w:r>
-        <w:t xml:space="preserve">se mide con la cinta métrica desde el punto de fijación hasta el centro de la esfera. El periodo se mide con la puerta fotoeléctrica, colocada en la posición de equilibrio de la esfera, y el contador en modo periodo. El cateto</w:t>
+        <w:t xml:space="preserve">se mide con la cinta métrica desde el punto de fijación hasta el centro de la esfera. El periodo se mide con la puerta fotoeléctrica, colocada en la posición de reposo de la esfera, con el contador en modo periodo. La distancia</w:t>
       </w:r>
       <w:r>
         <w:t xml:space="preserve"> </w:t>
@@ -739,7 +927,7 @@
         <w:t xml:space="preserve"> </w:t>
       </w:r>
       <w:r>
-        <w:t xml:space="preserve">se mide con una regla horizontal a la altura de la esfera, desde la vertical del punto de fijación (la posición de la esfera en reposo).</w:t>
+        <w:t xml:space="preserve">se mide con una regla horizontal a la altura de la esfera.</w:t>
       </w:r>
     </w:p>
     <w:bookmarkEnd w:id="26"/>
@@ -785,39 +973,7 @@
         <w:jc w:val="both"/>
       </w:pPr>
       <w:r>
-        <w:t xml:space="preserve">Para siete longitudes, de 20 cm a 80 cm en pasos de 10 cm, separar la esfera una distancia horizontal pequeña (</w:t>
-      </w:r>
-      <m:oMath>
-        <m:r>
-          <m:t>x</m:t>
-        </m:r>
-        <m:r>
-          <m:rPr>
-            <m:sty m:val="p"/>
-          </m:rPr>
-          <m:t>≲</m:t>
-        </m:r>
-        <m:r>
-          <m:t>0</m:t>
-        </m:r>
-        <m:r>
-          <m:rPr>
-            <m:sty m:val="p"/>
-          </m:rPr>
-          <m:t>,</m:t>
-        </m:r>
-        <m:r>
-          <m:t>1</m:t>
-        </m:r>
-        <m:r>
-          <m:t> </m:t>
-        </m:r>
-        <m:r>
-          <m:t>L</m:t>
-        </m:r>
-      </m:oMath>
-      <w:r>
-        <w:t xml:space="preserve">), soltarla y medir cinco veces el periodo</w:t>
+        <w:t xml:space="preserve">Para siete longitudes, de 20 cm a 80 cm de 10 en 10 cm, separar la esfera muy poco (unos centímetros), soltarla y medir cinco veces el periodo con la puerta fotoeléctrica. Escribir en las dos últimas columnas la media</w:t>
       </w:r>
       <w:r>
         <w:t xml:space="preserve"> </w:t>
@@ -840,7 +996,7 @@
         <w:t xml:space="preserve"> </w:t>
       </w:r>
       <w:r>
-        <w:t xml:space="preserve">con la puerta fotoeléctrica.</w:t>
+        <w:t xml:space="preserve">y su cuadrado, cada uno con su error.</w:t>
       </w:r>
     </w:p>
     <w:p>
@@ -851,7 +1007,7 @@
         <w:jc w:val="center"/>
       </w:pPr>
       <w:r>
-        <w:t xml:space="preserve">Tabla 1. Periodo para amplitud pequeña.</w:t>
+        <w:t xml:space="preserve">Tabla 1. Periodo para oscilaciones pequeñas.</w:t>
       </w:r>
     </w:p>
     <w:tbl>
@@ -867,19 +1023,17 @@
           <w:insideV w:val="single" w:sz="6" w:color="000000"/>
         </w:tblBorders>
         <w:tblLook w:firstRow="1" w:lastRow="0" w:firstColumn="0" w:lastColumn="0" w:noHBand="0" w:noVBand="0" w:val="0020"/>
-        <w:tblCaption w:val="Tabla 1. Periodo para amplitud pequeña."/>
+        <w:tblCaption w:val="Tabla 1. Periodo para oscilaciones pequeñas."/>
       </w:tblPr>
       <w:tblGrid>
-        <w:gridCol w:w="792"/>
-        <w:gridCol w:w="792"/>
-        <w:gridCol w:w="792"/>
-        <w:gridCol w:w="792"/>
-        <w:gridCol w:w="792"/>
-        <w:gridCol w:w="792"/>
-        <w:gridCol w:w="792"/>
-        <w:gridCol w:w="792"/>
-        <w:gridCol w:w="792"/>
-        <w:gridCol w:w="792"/>
+        <w:gridCol w:w="990"/>
+        <w:gridCol w:w="990"/>
+        <w:gridCol w:w="990"/>
+        <w:gridCol w:w="990"/>
+        <w:gridCol w:w="990"/>
+        <w:gridCol w:w="990"/>
+        <w:gridCol w:w="990"/>
+        <w:gridCol w:w="990"/>
       </w:tblGrid>
       <w:tr>
         <w:trPr>
@@ -912,6 +1066,196 @@
                 <w:sz w:val="20"/>
               </w:rPr>
               <w:t xml:space="preserve">(m)</w:t>
+            </w:r>
+          </w:p>
+        </w:tc>
+        <w:tc>
+          <w:tcPr>
+            <w:shd w:val="clear" w:color="auto" w:fill="FFF0C1"/>
+            <w:vAlign w:val="center"/>
+          </w:tcPr>
+          <w:p>
+            <w:pPr>
+              <w:pStyle w:val="Compact"/>
+              <w:jc w:val="center"/>
+            </w:pPr>
+            <m:oMath>
+              <m:sSub>
+                <m:e>
+                  <m:r>
+                    <m:t>T</m:t>
+                  </m:r>
+                </m:e>
+                <m:sub>
+                  <m:r>
+                    <m:t>1</m:t>
+                  </m:r>
+                </m:sub>
+              </m:sSub>
+            </m:oMath>
+            <w:r>
+              <w:rPr>
+                <w:sz w:val="20"/>
+              </w:rPr>
+              <w:t xml:space="preserve"> </w:t>
+            </w:r>
+            <w:r>
+              <w:rPr>
+                <w:sz w:val="20"/>
+              </w:rPr>
+              <w:t xml:space="preserve">(s)</w:t>
+            </w:r>
+          </w:p>
+        </w:tc>
+        <w:tc>
+          <w:tcPr>
+            <w:shd w:val="clear" w:color="auto" w:fill="FFF0C1"/>
+            <w:vAlign w:val="center"/>
+          </w:tcPr>
+          <w:p>
+            <w:pPr>
+              <w:pStyle w:val="Compact"/>
+              <w:jc w:val="center"/>
+            </w:pPr>
+            <m:oMath>
+              <m:sSub>
+                <m:e>
+                  <m:r>
+                    <m:t>T</m:t>
+                  </m:r>
+                </m:e>
+                <m:sub>
+                  <m:r>
+                    <m:t>2</m:t>
+                  </m:r>
+                </m:sub>
+              </m:sSub>
+            </m:oMath>
+            <w:r>
+              <w:rPr>
+                <w:sz w:val="20"/>
+              </w:rPr>
+              <w:t xml:space="preserve"> </w:t>
+            </w:r>
+            <w:r>
+              <w:rPr>
+                <w:sz w:val="20"/>
+              </w:rPr>
+              <w:t xml:space="preserve">(s)</w:t>
+            </w:r>
+          </w:p>
+        </w:tc>
+        <w:tc>
+          <w:tcPr>
+            <w:shd w:val="clear" w:color="auto" w:fill="FFF0C1"/>
+            <w:vAlign w:val="center"/>
+          </w:tcPr>
+          <w:p>
+            <w:pPr>
+              <w:pStyle w:val="Compact"/>
+              <w:jc w:val="center"/>
+            </w:pPr>
+            <m:oMath>
+              <m:sSub>
+                <m:e>
+                  <m:r>
+                    <m:t>T</m:t>
+                  </m:r>
+                </m:e>
+                <m:sub>
+                  <m:r>
+                    <m:t>3</m:t>
+                  </m:r>
+                </m:sub>
+              </m:sSub>
+            </m:oMath>
+            <w:r>
+              <w:rPr>
+                <w:sz w:val="20"/>
+              </w:rPr>
+              <w:t xml:space="preserve"> </w:t>
+            </w:r>
+            <w:r>
+              <w:rPr>
+                <w:sz w:val="20"/>
+              </w:rPr>
+              <w:t xml:space="preserve">(s)</w:t>
+            </w:r>
+          </w:p>
+        </w:tc>
+        <w:tc>
+          <w:tcPr>
+            <w:shd w:val="clear" w:color="auto" w:fill="FFF0C1"/>
+            <w:vAlign w:val="center"/>
+          </w:tcPr>
+          <w:p>
+            <w:pPr>
+              <w:pStyle w:val="Compact"/>
+              <w:jc w:val="center"/>
+            </w:pPr>
+            <m:oMath>
+              <m:sSub>
+                <m:e>
+                  <m:r>
+                    <m:t>T</m:t>
+                  </m:r>
+                </m:e>
+                <m:sub>
+                  <m:r>
+                    <m:t>4</m:t>
+                  </m:r>
+                </m:sub>
+              </m:sSub>
+            </m:oMath>
+            <w:r>
+              <w:rPr>
+                <w:sz w:val="20"/>
+              </w:rPr>
+              <w:t xml:space="preserve"> </w:t>
+            </w:r>
+            <w:r>
+              <w:rPr>
+                <w:sz w:val="20"/>
+              </w:rPr>
+              <w:t xml:space="preserve">(s)</w:t>
+            </w:r>
+          </w:p>
+        </w:tc>
+        <w:tc>
+          <w:tcPr>
+            <w:shd w:val="clear" w:color="auto" w:fill="FFF0C1"/>
+            <w:vAlign w:val="center"/>
+          </w:tcPr>
+          <w:p>
+            <w:pPr>
+              <w:pStyle w:val="Compact"/>
+              <w:jc w:val="center"/>
+            </w:pPr>
+            <m:oMath>
+              <m:sSub>
+                <m:e>
+                  <m:r>
+                    <m:t>T</m:t>
+                  </m:r>
+                </m:e>
+                <m:sub>
+                  <m:r>
+                    <m:t>5</m:t>
+                  </m:r>
+                </m:sub>
+              </m:sSub>
+            </m:oMath>
+            <w:r>
+              <w:rPr>
+                <w:sz w:val="20"/>
+              </w:rPr>
+              <w:t xml:space="preserve"> </w:t>
+            </w:r>
+            <w:r>
+              <w:rPr>
+                <w:sz w:val="20"/>
+              </w:rPr>
+              <w:t xml:space="preserve">(s)</w:t>
             </w:r>
           </w:p>
         </w:tc>
@@ -936,15 +1280,6 @@
                   <m:r>
                     <m:t>0</m:t>
                   </m:r>
-                  <m:r>
-                    <m:rPr>
-                      <m:sty m:val="p"/>
-                    </m:rPr>
-                    <m:t>,</m:t>
-                  </m:r>
-                  <m:r>
-                    <m:t>1</m:t>
-                  </m:r>
                 </m:sub>
               </m:sSub>
             </m:oMath>
@@ -973,298 +1308,11 @@
               <w:jc w:val="center"/>
             </w:pPr>
             <m:oMath>
-              <m:sSub>
+              <m:sSubSup>
                 <m:e>
                   <m:r>
                     <m:t>T</m:t>
                   </m:r>
-                </m:e>
-                <m:sub>
-                  <m:r>
-                    <m:t>0</m:t>
-                  </m:r>
-                  <m:r>
-                    <m:rPr>
-                      <m:sty m:val="p"/>
-                    </m:rPr>
-                    <m:t>,</m:t>
-                  </m:r>
-                  <m:r>
-                    <m:t>2</m:t>
-                  </m:r>
-                </m:sub>
-              </m:sSub>
-            </m:oMath>
-            <w:r>
-              <w:rPr>
-                <w:sz w:val="20"/>
-              </w:rPr>
-              <w:t xml:space="preserve"> </w:t>
-            </w:r>
-            <w:r>
-              <w:rPr>
-                <w:sz w:val="20"/>
-              </w:rPr>
-              <w:t xml:space="preserve">(s)</w:t>
-            </w:r>
-          </w:p>
-        </w:tc>
-        <w:tc>
-          <w:tcPr>
-            <w:shd w:val="clear" w:color="auto" w:fill="FFF0C1"/>
-            <w:vAlign w:val="center"/>
-          </w:tcPr>
-          <w:p>
-            <w:pPr>
-              <w:pStyle w:val="Compact"/>
-              <w:jc w:val="center"/>
-            </w:pPr>
-            <m:oMath>
-              <m:sSub>
-                <m:e>
-                  <m:r>
-                    <m:t>T</m:t>
-                  </m:r>
-                </m:e>
-                <m:sub>
-                  <m:r>
-                    <m:t>0</m:t>
-                  </m:r>
-                  <m:r>
-                    <m:rPr>
-                      <m:sty m:val="p"/>
-                    </m:rPr>
-                    <m:t>,</m:t>
-                  </m:r>
-                  <m:r>
-                    <m:t>3</m:t>
-                  </m:r>
-                </m:sub>
-              </m:sSub>
-            </m:oMath>
-            <w:r>
-              <w:rPr>
-                <w:sz w:val="20"/>
-              </w:rPr>
-              <w:t xml:space="preserve"> </w:t>
-            </w:r>
-            <w:r>
-              <w:rPr>
-                <w:sz w:val="20"/>
-              </w:rPr>
-              <w:t xml:space="preserve">(s)</w:t>
-            </w:r>
-          </w:p>
-        </w:tc>
-        <w:tc>
-          <w:tcPr>
-            <w:shd w:val="clear" w:color="auto" w:fill="FFF0C1"/>
-            <w:vAlign w:val="center"/>
-          </w:tcPr>
-          <w:p>
-            <w:pPr>
-              <w:pStyle w:val="Compact"/>
-              <w:jc w:val="center"/>
-            </w:pPr>
-            <m:oMath>
-              <m:sSub>
-                <m:e>
-                  <m:r>
-                    <m:t>T</m:t>
-                  </m:r>
-                </m:e>
-                <m:sub>
-                  <m:r>
-                    <m:t>0</m:t>
-                  </m:r>
-                  <m:r>
-                    <m:rPr>
-                      <m:sty m:val="p"/>
-                    </m:rPr>
-                    <m:t>,</m:t>
-                  </m:r>
-                  <m:r>
-                    <m:t>4</m:t>
-                  </m:r>
-                </m:sub>
-              </m:sSub>
-            </m:oMath>
-            <w:r>
-              <w:rPr>
-                <w:sz w:val="20"/>
-              </w:rPr>
-              <w:t xml:space="preserve"> </w:t>
-            </w:r>
-            <w:r>
-              <w:rPr>
-                <w:sz w:val="20"/>
-              </w:rPr>
-              <w:t xml:space="preserve">(s)</w:t>
-            </w:r>
-          </w:p>
-        </w:tc>
-        <w:tc>
-          <w:tcPr>
-            <w:shd w:val="clear" w:color="auto" w:fill="FFF0C1"/>
-            <w:vAlign w:val="center"/>
-          </w:tcPr>
-          <w:p>
-            <w:pPr>
-              <w:pStyle w:val="Compact"/>
-              <w:jc w:val="center"/>
-            </w:pPr>
-            <m:oMath>
-              <m:sSub>
-                <m:e>
-                  <m:r>
-                    <m:t>T</m:t>
-                  </m:r>
-                </m:e>
-                <m:sub>
-                  <m:r>
-                    <m:t>0</m:t>
-                  </m:r>
-                  <m:r>
-                    <m:rPr>
-                      <m:sty m:val="p"/>
-                    </m:rPr>
-                    <m:t>,</m:t>
-                  </m:r>
-                  <m:r>
-                    <m:t>5</m:t>
-                  </m:r>
-                </m:sub>
-              </m:sSub>
-            </m:oMath>
-            <w:r>
-              <w:rPr>
-                <w:sz w:val="20"/>
-              </w:rPr>
-              <w:t xml:space="preserve"> </w:t>
-            </w:r>
-            <w:r>
-              <w:rPr>
-                <w:sz w:val="20"/>
-              </w:rPr>
-              <w:t xml:space="preserve">(s)</w:t>
-            </w:r>
-          </w:p>
-        </w:tc>
-        <w:tc>
-          <w:tcPr>
-            <w:shd w:val="clear" w:color="auto" w:fill="FFF0C1"/>
-            <w:vAlign w:val="center"/>
-          </w:tcPr>
-          <w:p>
-            <w:pPr>
-              <w:pStyle w:val="Compact"/>
-              <w:jc w:val="center"/>
-            </w:pPr>
-            <m:oMath>
-              <m:sSub>
-                <m:e>
-                  <m:acc>
-                    <m:accPr>
-                      <m:chr m:val="‾"/>
-                    </m:accPr>
-                    <m:e>
-                      <m:r>
-                        <m:t>T</m:t>
-                      </m:r>
-                    </m:e>
-                  </m:acc>
-                </m:e>
-                <m:sub>
-                  <m:r>
-                    <m:t>0</m:t>
-                  </m:r>
-                </m:sub>
-              </m:sSub>
-            </m:oMath>
-            <w:r>
-              <w:rPr>
-                <w:sz w:val="20"/>
-              </w:rPr>
-              <w:t xml:space="preserve"> </w:t>
-            </w:r>
-            <w:r>
-              <w:rPr>
-                <w:sz w:val="20"/>
-              </w:rPr>
-              <w:t xml:space="preserve">(s)</w:t>
-            </w:r>
-          </w:p>
-        </w:tc>
-        <w:tc>
-          <w:tcPr>
-            <w:shd w:val="clear" w:color="auto" w:fill="FFF0C1"/>
-            <w:vAlign w:val="center"/>
-          </w:tcPr>
-          <w:p>
-            <w:pPr>
-              <w:pStyle w:val="Compact"/>
-              <w:jc w:val="center"/>
-            </w:pPr>
-            <m:oMath>
-              <m:sSub>
-                <m:e>
-                  <m:r>
-                    <m:t>ε</m:t>
-                  </m:r>
-                </m:e>
-                <m:sub>
-                  <m:sSub>
-                    <m:e>
-                      <m:r>
-                        <m:t>T</m:t>
-                      </m:r>
-                    </m:e>
-                    <m:sub>
-                      <m:r>
-                        <m:t>0</m:t>
-                      </m:r>
-                    </m:sub>
-                  </m:sSub>
-                </m:sub>
-              </m:sSub>
-            </m:oMath>
-            <w:r>
-              <w:rPr>
-                <w:sz w:val="20"/>
-              </w:rPr>
-              <w:t xml:space="preserve"> </w:t>
-            </w:r>
-            <w:r>
-              <w:rPr>
-                <w:sz w:val="20"/>
-              </w:rPr>
-              <w:t xml:space="preserve">(s)</w:t>
-            </w:r>
-          </w:p>
-        </w:tc>
-        <w:tc>
-          <w:tcPr>
-            <w:shd w:val="clear" w:color="auto" w:fill="FFF0C1"/>
-            <w:vAlign w:val="center"/>
-          </w:tcPr>
-          <w:p>
-            <w:pPr>
-              <w:pStyle w:val="Compact"/>
-              <w:jc w:val="center"/>
-            </w:pPr>
-            <m:oMath>
-              <m:sSubSup>
-                <m:e>
-                  <m:acc>
-                    <m:accPr>
-                      <m:chr m:val="‾"/>
-                    </m:accPr>
-                    <m:e>
-                      <m:r>
-                        <m:t>T</m:t>
-                      </m:r>
-                    </m:e>
-                  </m:acc>
                 </m:e>
                 <m:sub>
                   <m:r>
@@ -1292,58 +1340,6 @@
             </w:r>
           </w:p>
         </w:tc>
-        <w:tc>
-          <w:tcPr>
-            <w:shd w:val="clear" w:color="auto" w:fill="FFF0C1"/>
-            <w:vAlign w:val="center"/>
-          </w:tcPr>
-          <w:p>
-            <w:pPr>
-              <w:pStyle w:val="Compact"/>
-              <w:jc w:val="center"/>
-            </w:pPr>
-            <m:oMath>
-              <m:sSub>
-                <m:e>
-                  <m:r>
-                    <m:t>ε</m:t>
-                  </m:r>
-                </m:e>
-                <m:sub>
-                  <m:sSubSup>
-                    <m:e>
-                      <m:r>
-                        <m:t>T</m:t>
-                      </m:r>
-                    </m:e>
-                    <m:sub>
-                      <m:r>
-                        <m:t>0</m:t>
-                      </m:r>
-                    </m:sub>
-                    <m:sup>
-                      <m:r>
-                        <m:t>2</m:t>
-                      </m:r>
-                    </m:sup>
-                  </m:sSubSup>
-                </m:sub>
-              </m:sSub>
-            </m:oMath>
-            <w:r>
-              <w:rPr>
-                <w:sz w:val="20"/>
-              </w:rPr>
-              <w:t xml:space="preserve"> </w:t>
-            </w:r>
-            <w:r>
-              <w:rPr>
-                <w:sz w:val="20"/>
-              </w:rPr>
-              <w:t xml:space="preserve">(s²)</w:t>
-            </w:r>
-          </w:p>
-        </w:tc>
       </w:tr>
       <w:tr>
         <w:trPr>
@@ -1485,40 +1481,6 @@
             </w:r>
           </w:p>
         </w:tc>
-        <w:tc>
-          <w:tcPr>
-            <w:vAlign w:val="center"/>
-          </w:tcPr>
-          <w:p>
-            <w:pPr>
-              <w:pStyle w:val="Compact"/>
-              <w:jc w:val="center"/>
-            </w:pPr>
-            <w:r>
-              <w:rPr>
-                <w:sz w:val="20"/>
-              </w:rPr>
-              <w:t xml:space="preserve"> </w:t>
-            </w:r>
-          </w:p>
-        </w:tc>
-        <w:tc>
-          <w:tcPr>
-            <w:vAlign w:val="center"/>
-          </w:tcPr>
-          <w:p>
-            <w:pPr>
-              <w:pStyle w:val="Compact"/>
-              <w:jc w:val="center"/>
-            </w:pPr>
-            <w:r>
-              <w:rPr>
-                <w:sz w:val="20"/>
-              </w:rPr>
-              <w:t xml:space="preserve"> </w:t>
-            </w:r>
-          </w:p>
-        </w:tc>
       </w:tr>
       <w:tr>
         <w:trPr>
@@ -1660,40 +1622,6 @@
             </w:r>
           </w:p>
         </w:tc>
-        <w:tc>
-          <w:tcPr>
-            <w:vAlign w:val="center"/>
-          </w:tcPr>
-          <w:p>
-            <w:pPr>
-              <w:pStyle w:val="Compact"/>
-              <w:jc w:val="center"/>
-            </w:pPr>
-            <w:r>
-              <w:rPr>
-                <w:sz w:val="20"/>
-              </w:rPr>
-              <w:t xml:space="preserve"> </w:t>
-            </w:r>
-          </w:p>
-        </w:tc>
-        <w:tc>
-          <w:tcPr>
-            <w:vAlign w:val="center"/>
-          </w:tcPr>
-          <w:p>
-            <w:pPr>
-              <w:pStyle w:val="Compact"/>
-              <w:jc w:val="center"/>
-            </w:pPr>
-            <w:r>
-              <w:rPr>
-                <w:sz w:val="20"/>
-              </w:rPr>
-              <w:t xml:space="preserve"> </w:t>
-            </w:r>
-          </w:p>
-        </w:tc>
       </w:tr>
       <w:tr>
         <w:trPr>
@@ -1835,40 +1763,6 @@
             </w:r>
           </w:p>
         </w:tc>
-        <w:tc>
-          <w:tcPr>
-            <w:vAlign w:val="center"/>
-          </w:tcPr>
-          <w:p>
-            <w:pPr>
-              <w:pStyle w:val="Compact"/>
-              <w:jc w:val="center"/>
-            </w:pPr>
-            <w:r>
-              <w:rPr>
-                <w:sz w:val="20"/>
-              </w:rPr>
-              <w:t xml:space="preserve"> </w:t>
-            </w:r>
-          </w:p>
-        </w:tc>
-        <w:tc>
-          <w:tcPr>
-            <w:vAlign w:val="center"/>
-          </w:tcPr>
-          <w:p>
-            <w:pPr>
-              <w:pStyle w:val="Compact"/>
-              <w:jc w:val="center"/>
-            </w:pPr>
-            <w:r>
-              <w:rPr>
-                <w:sz w:val="20"/>
-              </w:rPr>
-              <w:t xml:space="preserve"> </w:t>
-            </w:r>
-          </w:p>
-        </w:tc>
       </w:tr>
       <w:tr>
         <w:trPr>
@@ -2010,40 +1904,6 @@
             </w:r>
           </w:p>
         </w:tc>
-        <w:tc>
-          <w:tcPr>
-            <w:vAlign w:val="center"/>
-          </w:tcPr>
-          <w:p>
-            <w:pPr>
-              <w:pStyle w:val="Compact"/>
-              <w:jc w:val="center"/>
-            </w:pPr>
-            <w:r>
-              <w:rPr>
-                <w:sz w:val="20"/>
-              </w:rPr>
-              <w:t xml:space="preserve"> </w:t>
-            </w:r>
-          </w:p>
-        </w:tc>
-        <w:tc>
-          <w:tcPr>
-            <w:vAlign w:val="center"/>
-          </w:tcPr>
-          <w:p>
-            <w:pPr>
-              <w:pStyle w:val="Compact"/>
-              <w:jc w:val="center"/>
-            </w:pPr>
-            <w:r>
-              <w:rPr>
-                <w:sz w:val="20"/>
-              </w:rPr>
-              <w:t xml:space="preserve"> </w:t>
-            </w:r>
-          </w:p>
-        </w:tc>
       </w:tr>
       <w:tr>
         <w:trPr>
@@ -2185,40 +2045,6 @@
             </w:r>
           </w:p>
         </w:tc>
-        <w:tc>
-          <w:tcPr>
-            <w:vAlign w:val="center"/>
-          </w:tcPr>
-          <w:p>
-            <w:pPr>
-              <w:pStyle w:val="Compact"/>
-              <w:jc w:val="center"/>
-            </w:pPr>
-            <w:r>
-              <w:rPr>
-                <w:sz w:val="20"/>
-              </w:rPr>
-              <w:t xml:space="preserve"> </w:t>
-            </w:r>
-          </w:p>
-        </w:tc>
-        <w:tc>
-          <w:tcPr>
-            <w:vAlign w:val="center"/>
-          </w:tcPr>
-          <w:p>
-            <w:pPr>
-              <w:pStyle w:val="Compact"/>
-              <w:jc w:val="center"/>
-            </w:pPr>
-            <w:r>
-              <w:rPr>
-                <w:sz w:val="20"/>
-              </w:rPr>
-              <w:t xml:space="preserve"> </w:t>
-            </w:r>
-          </w:p>
-        </w:tc>
       </w:tr>
       <w:tr>
         <w:trPr>
@@ -2360,79 +2186,11 @@
             </w:r>
           </w:p>
         </w:tc>
-        <w:tc>
-          <w:tcPr>
-            <w:vAlign w:val="center"/>
-          </w:tcPr>
-          <w:p>
-            <w:pPr>
-              <w:pStyle w:val="Compact"/>
-              <w:jc w:val="center"/>
-            </w:pPr>
-            <w:r>
-              <w:rPr>
-                <w:sz w:val="20"/>
-              </w:rPr>
-              <w:t xml:space="preserve"> </w:t>
-            </w:r>
-          </w:p>
-        </w:tc>
-        <w:tc>
-          <w:tcPr>
-            <w:vAlign w:val="center"/>
-          </w:tcPr>
-          <w:p>
-            <w:pPr>
-              <w:pStyle w:val="Compact"/>
-              <w:jc w:val="center"/>
-            </w:pPr>
-            <w:r>
-              <w:rPr>
-                <w:sz w:val="20"/>
-              </w:rPr>
-              <w:t xml:space="preserve"> </w:t>
-            </w:r>
-          </w:p>
-        </w:tc>
       </w:tr>
       <w:tr>
         <w:trPr>
           <w:trHeight w:val="425" w:hRule="atLeast"/>
         </w:trPr>
-        <w:tc>
-          <w:tcPr>
-            <w:vAlign w:val="center"/>
-          </w:tcPr>
-          <w:p>
-            <w:pPr>
-              <w:pStyle w:val="Compact"/>
-              <w:jc w:val="center"/>
-            </w:pPr>
-            <w:r>
-              <w:rPr>
-                <w:sz w:val="20"/>
-              </w:rPr>
-              <w:t xml:space="preserve"> </w:t>
-            </w:r>
-          </w:p>
-        </w:tc>
-        <w:tc>
-          <w:tcPr>
-            <w:vAlign w:val="center"/>
-          </w:tcPr>
-          <w:p>
-            <w:pPr>
-              <w:pStyle w:val="Compact"/>
-              <w:jc w:val="center"/>
-            </w:pPr>
-            <w:r>
-              <w:rPr>
-                <w:sz w:val="20"/>
-              </w:rPr>
-              <w:t xml:space="preserve"> </w:t>
-            </w:r>
-          </w:p>
-        </w:tc>
         <w:tc>
           <w:tcPr>
             <w:vAlign w:val="center"/>
@@ -2597,23 +2355,49 @@
         <w:jc w:val="both"/>
       </w:pPr>
       <w:r>
-        <w:t xml:space="preserve">Fijar la longitud en 80 cm y medir con precisión</w:t>
+        <w:t xml:space="preserve">Dejar la longitud en 80 cm. Soltar la esfera desde</w:t>
       </w:r>
       <w:r>
         <w:t xml:space="preserve"> </w:t>
       </w:r>
       <m:oMath>
         <m:r>
-          <m:t>L</m:t>
+          <m:t>x</m:t>
         </m:r>
       </m:oMath>
       <w:r>
-        <w:t xml:space="preserve">. Para seis amplitudes, con</w:t>
+        <w:t xml:space="preserve"> </w:t>
+      </w:r>
+      <w:r>
+        <w:t xml:space="preserve">= 5, 15, 25, 35, 45 y 55 cm y medir cada vez el periodo de la primera oscilación, en la que la amplitud apenas ha disminuido. Tomar como</w:t>
       </w:r>
       <w:r>
         <w:t xml:space="preserve"> </w:t>
       </w:r>
       <m:oMath>
+        <m:sSub>
+          <m:e>
+            <m:r>
+              <m:t>T</m:t>
+            </m:r>
+          </m:e>
+          <m:sub>
+            <m:r>
+              <m:t>0</m:t>
+            </m:r>
+          </m:sub>
+        </m:sSub>
+      </m:oMath>
+      <w:r>
+        <w:t xml:space="preserve"> </w:t>
+      </w:r>
+      <w:r>
+        <w:t xml:space="preserve">el periodo medido con</w:t>
+      </w:r>
+      <w:r>
+        <w:t xml:space="preserve"> </w:t>
+      </w:r>
+      <m:oMath>
         <m:r>
           <m:t>x</m:t>
         </m:r>
@@ -2622,7 +2406,7 @@
         <w:t xml:space="preserve"> </w:t>
       </w:r>
       <w:r>
-        <w:t xml:space="preserve">= 5, 15, 25, 35, 45 y 55 cm, soltar la esfera sin velocidad desde esa posición y medir tres veces el periodo de la primera oscilación (en pocas oscilaciones la amplitud apenas disminuye). Calcular</w:t>
+        <w:t xml:space="preserve">= 5 cm. Calcular</w:t>
       </w:r>
       <w:r>
         <w:t xml:space="preserve"> </w:t>
@@ -2640,17 +2424,89 @@
             </m:r>
           </m:sub>
         </m:sSub>
+        <m:r>
+          <m:rPr>
+            <m:sty m:val="p"/>
+          </m:rPr>
+          <m:t>=</m:t>
+        </m:r>
+        <m:r>
+          <m:rPr>
+            <m:sty m:val="p"/>
+          </m:rPr>
+          <m:t>arcsin</m:t>
+        </m:r>
+        <m:d>
+          <m:dPr>
+            <m:begChr m:val="("/>
+            <m:endChr m:val=")"/>
+            <m:sepChr m:val=""/>
+            <m:grow/>
+          </m:dPr>
+          <m:e>
+            <m:r>
+              <m:t>x</m:t>
+            </m:r>
+            <m:r>
+              <m:rPr>
+                <m:sty m:val="p"/>
+              </m:rPr>
+              <m:t>/</m:t>
+            </m:r>
+            <m:r>
+              <m:t>L</m:t>
+            </m:r>
+          </m:e>
+        </m:d>
       </m:oMath>
       <w:r>
-        <w:t xml:space="preserve"> </w:t>
-      </w:r>
-      <w:r>
-        <w:t xml:space="preserve">y</w:t>
+        <w:t xml:space="preserve">, el cociente medido</w:t>
       </w:r>
       <w:r>
         <w:t xml:space="preserve"> </w:t>
       </w:r>
       <m:oMath>
+        <m:r>
+          <m:t>T</m:t>
+        </m:r>
+        <m:r>
+          <m:rPr>
+            <m:sty m:val="p"/>
+          </m:rPr>
+          <m:t>/</m:t>
+        </m:r>
+        <m:sSub>
+          <m:e>
+            <m:r>
+              <m:t>T</m:t>
+            </m:r>
+          </m:e>
+          <m:sub>
+            <m:r>
+              <m:t>0</m:t>
+            </m:r>
+          </m:sub>
+        </m:sSub>
+      </m:oMath>
+      <w:r>
+        <w:t xml:space="preserve"> </w:t>
+      </w:r>
+      <w:r>
+        <w:t xml:space="preserve">y el que predice la teoría,</w:t>
+      </w:r>
+      <w:r>
+        <w:t xml:space="preserve"> </w:t>
+      </w:r>
+      <m:oMath>
+        <m:r>
+          <m:t>1</m:t>
+        </m:r>
+        <m:r>
+          <m:rPr>
+            <m:sty m:val="p"/>
+          </m:rPr>
+          <m:t>+</m:t>
+        </m:r>
         <m:sSubSup>
           <m:e>
             <m:r>
@@ -2668,67 +2524,18 @@
             </m:r>
           </m:sup>
         </m:sSubSup>
+        <m:r>
+          <m:rPr>
+            <m:sty m:val="p"/>
+          </m:rPr>
+          <m:t>/</m:t>
+        </m:r>
+        <m:r>
+          <m:t>16</m:t>
+        </m:r>
       </m:oMath>
       <w:r>
-        <w:t xml:space="preserve"> </w:t>
-      </w:r>
-      <w:r>
-        <w:t xml:space="preserve">con su error. Tomar como</w:t>
-      </w:r>
-      <w:r>
-        <w:t xml:space="preserve"> </w:t>
-      </w:r>
-      <m:oMath>
-        <m:sSub>
-          <m:e>
-            <m:r>
-              <m:t>T</m:t>
-            </m:r>
-          </m:e>
-          <m:sub>
-            <m:r>
-              <m:t>0</m:t>
-            </m:r>
-          </m:sub>
-        </m:sSub>
-      </m:oMath>
-      <w:r>
-        <w:t xml:space="preserve"> </w:t>
-      </w:r>
-      <w:r>
-        <w:t xml:space="preserve">el periodo medido con</w:t>
-      </w:r>
-      <w:r>
-        <w:t xml:space="preserve"> </w:t>
-      </w:r>
-      <m:oMath>
-        <m:r>
-          <m:t>x</m:t>
-        </m:r>
-      </m:oMath>
-      <w:r>
-        <w:t xml:space="preserve"> </w:t>
-      </w:r>
-      <w:r>
-        <w:t xml:space="preserve">= 5 cm.</w:t>
-      </w:r>
-    </w:p>
-    <w:p>
-      <w:pPr>
-        <w:pStyle w:val="BodyText"/>
-        <w:spacing w:after="120" w:line="276" w:lineRule="auto"/>
-        <w:jc w:val="both"/>
-      </w:pPr>
-      <m:oMath>
-        <m:r>
-          <m:t>L</m:t>
-        </m:r>
-      </m:oMath>
-      <w:r>
-        <w:t xml:space="preserve"> </w:t>
-      </w:r>
-      <w:r>
-        <w:t xml:space="preserve">= ______________________</w:t>
+        <w:t xml:space="preserve">.</w:t>
       </w:r>
     </w:p>
     <w:p>
@@ -2739,7 +2546,18 @@
         <w:jc w:val="center"/>
       </w:pPr>
       <w:r>
-        <w:t xml:space="preserve">Tabla 2. Periodo para amplitudes crecientes.</w:t>
+        <w:t xml:space="preserve">Tabla 2. Periodo para amplitudes crecientes (</w:t>
+      </w:r>
+      <m:oMath>
+        <m:r>
+          <m:t>L</m:t>
+        </m:r>
+      </m:oMath>
+      <w:r>
+        <w:t xml:space="preserve"> </w:t>
+      </w:r>
+      <w:r>
+        <w:t xml:space="preserve">= 0,80 m).</w:t>
       </w:r>
     </w:p>
     <w:tbl>
@@ -2755,18 +2573,14 @@
           <w:insideV w:val="single" w:sz="6" w:color="000000"/>
         </w:tblBorders>
         <w:tblLook w:firstRow="1" w:lastRow="0" w:firstColumn="0" w:lastColumn="0" w:noHBand="0" w:noVBand="0" w:val="0020"/>
-        <w:tblCaption w:val="Tabla 2. Periodo para amplitudes crecientes."/>
+        <w:tblCaption w:val="Tabla 2. Periodo para amplitudes crecientes (L = 0,80 m)."/>
       </w:tblPr>
       <w:tblGrid>
-        <w:gridCol w:w="879"/>
-        <w:gridCol w:w="879"/>
-        <w:gridCol w:w="879"/>
-        <w:gridCol w:w="879"/>
-        <w:gridCol w:w="879"/>
-        <w:gridCol w:w="879"/>
-        <w:gridCol w:w="879"/>
-        <w:gridCol w:w="879"/>
-        <w:gridCol w:w="879"/>
+        <w:gridCol w:w="1584"/>
+        <w:gridCol w:w="1584"/>
+        <w:gridCol w:w="1584"/>
+        <w:gridCol w:w="1584"/>
+        <w:gridCol w:w="1584"/>
       </w:tblGrid>
       <w:tr>
         <w:trPr>
@@ -2851,27 +2665,9 @@
               <w:jc w:val="center"/>
             </w:pPr>
             <m:oMath>
-              <m:sSub>
-                <m:e>
-                  <m:r>
-                    <m:t>ε</m:t>
-                  </m:r>
-                </m:e>
-                <m:sub>
-                  <m:sSub>
-                    <m:e>
-                      <m:r>
-                        <m:t>θ</m:t>
-                      </m:r>
-                    </m:e>
-                    <m:sub>
-                      <m:r>
-                        <m:t>0</m:t>
-                      </m:r>
-                    </m:sub>
-                  </m:sSub>
-                </m:sub>
-              </m:sSub>
+              <m:r>
+                <m:t>T</m:t>
+              </m:r>
             </m:oMath>
             <w:r>
               <w:rPr>
@@ -2883,7 +2679,7 @@
               <w:rPr>
                 <w:sz w:val="20"/>
               </w:rPr>
-              <w:t xml:space="preserve">(rad)</w:t>
+              <w:t xml:space="preserve">(s)</w:t>
             </w:r>
           </w:p>
         </w:tc>
@@ -2898,209 +2694,9 @@
               <w:jc w:val="center"/>
             </w:pPr>
             <m:oMath>
-              <m:sSubSup>
-                <m:e>
-                  <m:r>
-                    <m:t>θ</m:t>
-                  </m:r>
-                </m:e>
-                <m:sub>
-                  <m:r>
-                    <m:t>0</m:t>
-                  </m:r>
-                </m:sub>
-                <m:sup>
-                  <m:r>
-                    <m:t>2</m:t>
-                  </m:r>
-                </m:sup>
-              </m:sSubSup>
-            </m:oMath>
-            <w:r>
-              <w:rPr>
-                <w:sz w:val="20"/>
-              </w:rPr>
-              <w:t xml:space="preserve"> </w:t>
-            </w:r>
-            <w:r>
-              <w:rPr>
-                <w:sz w:val="20"/>
-              </w:rPr>
-              <w:t xml:space="preserve">(rad²)</w:t>
-            </w:r>
-          </w:p>
-        </w:tc>
-        <w:tc>
-          <w:tcPr>
-            <w:shd w:val="clear" w:color="auto" w:fill="FFF0C1"/>
-            <w:vAlign w:val="center"/>
-          </w:tcPr>
-          <w:p>
-            <w:pPr>
-              <w:pStyle w:val="Compact"/>
-              <w:jc w:val="center"/>
-            </w:pPr>
-            <m:oMath>
-              <m:sSub>
-                <m:e>
-                  <m:r>
-                    <m:t>T</m:t>
-                  </m:r>
-                </m:e>
-                <m:sub>
-                  <m:r>
-                    <m:t>1</m:t>
-                  </m:r>
-                </m:sub>
-              </m:sSub>
-            </m:oMath>
-            <w:r>
-              <w:rPr>
-                <w:sz w:val="20"/>
-              </w:rPr>
-              <w:t xml:space="preserve"> </w:t>
-            </w:r>
-            <w:r>
-              <w:rPr>
-                <w:sz w:val="20"/>
-              </w:rPr>
-              <w:t xml:space="preserve">(s)</w:t>
-            </w:r>
-          </w:p>
-        </w:tc>
-        <w:tc>
-          <w:tcPr>
-            <w:shd w:val="clear" w:color="auto" w:fill="FFF0C1"/>
-            <w:vAlign w:val="center"/>
-          </w:tcPr>
-          <w:p>
-            <w:pPr>
-              <w:pStyle w:val="Compact"/>
-              <w:jc w:val="center"/>
-            </w:pPr>
-            <m:oMath>
-              <m:sSub>
-                <m:e>
-                  <m:r>
-                    <m:t>T</m:t>
-                  </m:r>
-                </m:e>
-                <m:sub>
-                  <m:r>
-                    <m:t>2</m:t>
-                  </m:r>
-                </m:sub>
-              </m:sSub>
-            </m:oMath>
-            <w:r>
-              <w:rPr>
-                <w:sz w:val="20"/>
-              </w:rPr>
-              <w:t xml:space="preserve"> </w:t>
-            </w:r>
-            <w:r>
-              <w:rPr>
-                <w:sz w:val="20"/>
-              </w:rPr>
-              <w:t xml:space="preserve">(s)</w:t>
-            </w:r>
-          </w:p>
-        </w:tc>
-        <w:tc>
-          <w:tcPr>
-            <w:shd w:val="clear" w:color="auto" w:fill="FFF0C1"/>
-            <w:vAlign w:val="center"/>
-          </w:tcPr>
-          <w:p>
-            <w:pPr>
-              <w:pStyle w:val="Compact"/>
-              <w:jc w:val="center"/>
-            </w:pPr>
-            <m:oMath>
-              <m:sSub>
-                <m:e>
-                  <m:r>
-                    <m:t>T</m:t>
-                  </m:r>
-                </m:e>
-                <m:sub>
-                  <m:r>
-                    <m:t>3</m:t>
-                  </m:r>
-                </m:sub>
-              </m:sSub>
-            </m:oMath>
-            <w:r>
-              <w:rPr>
-                <w:sz w:val="20"/>
-              </w:rPr>
-              <w:t xml:space="preserve"> </w:t>
-            </w:r>
-            <w:r>
-              <w:rPr>
-                <w:sz w:val="20"/>
-              </w:rPr>
-              <w:t xml:space="preserve">(s)</w:t>
-            </w:r>
-          </w:p>
-        </w:tc>
-        <w:tc>
-          <w:tcPr>
-            <w:shd w:val="clear" w:color="auto" w:fill="FFF0C1"/>
-            <w:vAlign w:val="center"/>
-          </w:tcPr>
-          <w:p>
-            <w:pPr>
-              <w:pStyle w:val="Compact"/>
-              <w:jc w:val="center"/>
-            </w:pPr>
-            <m:oMath>
-              <m:acc>
-                <m:accPr>
-                  <m:chr m:val="‾"/>
-                </m:accPr>
-                <m:e>
-                  <m:r>
-                    <m:t>T</m:t>
-                  </m:r>
-                </m:e>
-              </m:acc>
-            </m:oMath>
-            <w:r>
-              <w:rPr>
-                <w:sz w:val="20"/>
-              </w:rPr>
-              <w:t xml:space="preserve"> </w:t>
-            </w:r>
-            <w:r>
-              <w:rPr>
-                <w:sz w:val="20"/>
-              </w:rPr>
-              <w:t xml:space="preserve">(s)</w:t>
-            </w:r>
-          </w:p>
-        </w:tc>
-        <w:tc>
-          <w:tcPr>
-            <w:shd w:val="clear" w:color="auto" w:fill="FFF0C1"/>
-            <w:vAlign w:val="center"/>
-          </w:tcPr>
-          <w:p>
-            <w:pPr>
-              <w:pStyle w:val="Compact"/>
-              <w:jc w:val="center"/>
-            </w:pPr>
-            <m:oMath>
-              <m:acc>
-                <m:accPr>
-                  <m:chr m:val="‾"/>
-                </m:accPr>
-                <m:e>
-                  <m:r>
-                    <m:t>T</m:t>
-                  </m:r>
-                </m:e>
-              </m:acc>
+              <m:r>
+                <m:t>T</m:t>
+              </m:r>
               <m:r>
                 <m:rPr>
                   <m:sty m:val="p"/>
@@ -3120,6 +2716,67 @@
                 </m:sub>
               </m:sSub>
             </m:oMath>
+            <w:r>
+              <w:rPr>
+                <w:sz w:val="20"/>
+              </w:rPr>
+              <w:t xml:space="preserve"> </w:t>
+            </w:r>
+            <w:r>
+              <w:rPr>
+                <w:sz w:val="20"/>
+              </w:rPr>
+              <w:t xml:space="preserve">medido</w:t>
+            </w:r>
+          </w:p>
+        </w:tc>
+        <w:tc>
+          <w:tcPr>
+            <w:shd w:val="clear" w:color="auto" w:fill="FFF0C1"/>
+            <w:vAlign w:val="center"/>
+          </w:tcPr>
+          <w:p>
+            <w:pPr>
+              <w:pStyle w:val="Compact"/>
+              <w:jc w:val="center"/>
+            </w:pPr>
+            <m:oMath>
+              <m:r>
+                <m:t>1</m:t>
+              </m:r>
+              <m:r>
+                <m:rPr>
+                  <m:sty m:val="p"/>
+                </m:rPr>
+                <m:t>+</m:t>
+              </m:r>
+              <m:sSubSup>
+                <m:e>
+                  <m:r>
+                    <m:t>θ</m:t>
+                  </m:r>
+                </m:e>
+                <m:sub>
+                  <m:r>
+                    <m:t>0</m:t>
+                  </m:r>
+                </m:sub>
+                <m:sup>
+                  <m:r>
+                    <m:t>2</m:t>
+                  </m:r>
+                </m:sup>
+              </m:sSubSup>
+              <m:r>
+                <m:rPr>
+                  <m:sty m:val="p"/>
+                </m:rPr>
+                <m:t>/</m:t>
+              </m:r>
+              <m:r>
+                <m:t>16</m:t>
+              </m:r>
+            </m:oMath>
           </w:p>
         </w:tc>
       </w:tr>
@@ -3212,74 +2869,6 @@
             </w:r>
           </w:p>
         </w:tc>
-        <w:tc>
-          <w:tcPr>
-            <w:vAlign w:val="center"/>
-          </w:tcPr>
-          <w:p>
-            <w:pPr>
-              <w:pStyle w:val="Compact"/>
-              <w:jc w:val="center"/>
-            </w:pPr>
-            <w:r>
-              <w:rPr>
-                <w:sz w:val="20"/>
-              </w:rPr>
-              <w:t xml:space="preserve"> </w:t>
-            </w:r>
-          </w:p>
-        </w:tc>
-        <w:tc>
-          <w:tcPr>
-            <w:vAlign w:val="center"/>
-          </w:tcPr>
-          <w:p>
-            <w:pPr>
-              <w:pStyle w:val="Compact"/>
-              <w:jc w:val="center"/>
-            </w:pPr>
-            <w:r>
-              <w:rPr>
-                <w:sz w:val="20"/>
-              </w:rPr>
-              <w:t xml:space="preserve"> </w:t>
-            </w:r>
-          </w:p>
-        </w:tc>
-        <w:tc>
-          <w:tcPr>
-            <w:vAlign w:val="center"/>
-          </w:tcPr>
-          <w:p>
-            <w:pPr>
-              <w:pStyle w:val="Compact"/>
-              <w:jc w:val="center"/>
-            </w:pPr>
-            <w:r>
-              <w:rPr>
-                <w:sz w:val="20"/>
-              </w:rPr>
-              <w:t xml:space="preserve"> </w:t>
-            </w:r>
-          </w:p>
-        </w:tc>
-        <w:tc>
-          <w:tcPr>
-            <w:vAlign w:val="center"/>
-          </w:tcPr>
-          <w:p>
-            <w:pPr>
-              <w:pStyle w:val="Compact"/>
-              <w:jc w:val="center"/>
-            </w:pPr>
-            <w:r>
-              <w:rPr>
-                <w:sz w:val="20"/>
-              </w:rPr>
-              <w:t xml:space="preserve"> </w:t>
-            </w:r>
-          </w:p>
-        </w:tc>
       </w:tr>
       <w:tr>
         <w:trPr>
@@ -3370,74 +2959,6 @@
             </w:r>
           </w:p>
         </w:tc>
-        <w:tc>
-          <w:tcPr>
-            <w:vAlign w:val="center"/>
-          </w:tcPr>
-          <w:p>
-            <w:pPr>
-              <w:pStyle w:val="Compact"/>
-              <w:jc w:val="center"/>
-            </w:pPr>
-            <w:r>
-              <w:rPr>
-                <w:sz w:val="20"/>
-              </w:rPr>
-              <w:t xml:space="preserve"> </w:t>
-            </w:r>
-          </w:p>
-        </w:tc>
-        <w:tc>
-          <w:tcPr>
-            <w:vAlign w:val="center"/>
-          </w:tcPr>
-          <w:p>
-            <w:pPr>
-              <w:pStyle w:val="Compact"/>
-              <w:jc w:val="center"/>
-            </w:pPr>
-            <w:r>
-              <w:rPr>
-                <w:sz w:val="20"/>
-              </w:rPr>
-              <w:t xml:space="preserve"> </w:t>
-            </w:r>
-          </w:p>
-        </w:tc>
-        <w:tc>
-          <w:tcPr>
-            <w:vAlign w:val="center"/>
-          </w:tcPr>
-          <w:p>
-            <w:pPr>
-              <w:pStyle w:val="Compact"/>
-              <w:jc w:val="center"/>
-            </w:pPr>
-            <w:r>
-              <w:rPr>
-                <w:sz w:val="20"/>
-              </w:rPr>
-              <w:t xml:space="preserve"> </w:t>
-            </w:r>
-          </w:p>
-        </w:tc>
-        <w:tc>
-          <w:tcPr>
-            <w:vAlign w:val="center"/>
-          </w:tcPr>
-          <w:p>
-            <w:pPr>
-              <w:pStyle w:val="Compact"/>
-              <w:jc w:val="center"/>
-            </w:pPr>
-            <w:r>
-              <w:rPr>
-                <w:sz w:val="20"/>
-              </w:rPr>
-              <w:t xml:space="preserve"> </w:t>
-            </w:r>
-          </w:p>
-        </w:tc>
       </w:tr>
       <w:tr>
         <w:trPr>
@@ -3528,74 +3049,6 @@
             </w:r>
           </w:p>
         </w:tc>
-        <w:tc>
-          <w:tcPr>
-            <w:vAlign w:val="center"/>
-          </w:tcPr>
-          <w:p>
-            <w:pPr>
-              <w:pStyle w:val="Compact"/>
-              <w:jc w:val="center"/>
-            </w:pPr>
-            <w:r>
-              <w:rPr>
-                <w:sz w:val="20"/>
-              </w:rPr>
-              <w:t xml:space="preserve"> </w:t>
-            </w:r>
-          </w:p>
-        </w:tc>
-        <w:tc>
-          <w:tcPr>
-            <w:vAlign w:val="center"/>
-          </w:tcPr>
-          <w:p>
-            <w:pPr>
-              <w:pStyle w:val="Compact"/>
-              <w:jc w:val="center"/>
-            </w:pPr>
-            <w:r>
-              <w:rPr>
-                <w:sz w:val="20"/>
-              </w:rPr>
-              <w:t xml:space="preserve"> </w:t>
-            </w:r>
-          </w:p>
-        </w:tc>
-        <w:tc>
-          <w:tcPr>
-            <w:vAlign w:val="center"/>
-          </w:tcPr>
-          <w:p>
-            <w:pPr>
-              <w:pStyle w:val="Compact"/>
-              <w:jc w:val="center"/>
-            </w:pPr>
-            <w:r>
-              <w:rPr>
-                <w:sz w:val="20"/>
-              </w:rPr>
-              <w:t xml:space="preserve"> </w:t>
-            </w:r>
-          </w:p>
-        </w:tc>
-        <w:tc>
-          <w:tcPr>
-            <w:vAlign w:val="center"/>
-          </w:tcPr>
-          <w:p>
-            <w:pPr>
-              <w:pStyle w:val="Compact"/>
-              <w:jc w:val="center"/>
-            </w:pPr>
-            <w:r>
-              <w:rPr>
-                <w:sz w:val="20"/>
-              </w:rPr>
-              <w:t xml:space="preserve"> </w:t>
-            </w:r>
-          </w:p>
-        </w:tc>
       </w:tr>
       <w:tr>
         <w:trPr>
@@ -3686,74 +3139,6 @@
             </w:r>
           </w:p>
         </w:tc>
-        <w:tc>
-          <w:tcPr>
-            <w:vAlign w:val="center"/>
-          </w:tcPr>
-          <w:p>
-            <w:pPr>
-              <w:pStyle w:val="Compact"/>
-              <w:jc w:val="center"/>
-            </w:pPr>
-            <w:r>
-              <w:rPr>
-                <w:sz w:val="20"/>
-              </w:rPr>
-              <w:t xml:space="preserve"> </w:t>
-            </w:r>
-          </w:p>
-        </w:tc>
-        <w:tc>
-          <w:tcPr>
-            <w:vAlign w:val="center"/>
-          </w:tcPr>
-          <w:p>
-            <w:pPr>
-              <w:pStyle w:val="Compact"/>
-              <w:jc w:val="center"/>
-            </w:pPr>
-            <w:r>
-              <w:rPr>
-                <w:sz w:val="20"/>
-              </w:rPr>
-              <w:t xml:space="preserve"> </w:t>
-            </w:r>
-          </w:p>
-        </w:tc>
-        <w:tc>
-          <w:tcPr>
-            <w:vAlign w:val="center"/>
-          </w:tcPr>
-          <w:p>
-            <w:pPr>
-              <w:pStyle w:val="Compact"/>
-              <w:jc w:val="center"/>
-            </w:pPr>
-            <w:r>
-              <w:rPr>
-                <w:sz w:val="20"/>
-              </w:rPr>
-              <w:t xml:space="preserve"> </w:t>
-            </w:r>
-          </w:p>
-        </w:tc>
-        <w:tc>
-          <w:tcPr>
-            <w:vAlign w:val="center"/>
-          </w:tcPr>
-          <w:p>
-            <w:pPr>
-              <w:pStyle w:val="Compact"/>
-              <w:jc w:val="center"/>
-            </w:pPr>
-            <w:r>
-              <w:rPr>
-                <w:sz w:val="20"/>
-              </w:rPr>
-              <w:t xml:space="preserve"> </w:t>
-            </w:r>
-          </w:p>
-        </w:tc>
       </w:tr>
       <w:tr>
         <w:trPr>
@@ -3844,147 +3229,11 @@
             </w:r>
           </w:p>
         </w:tc>
-        <w:tc>
-          <w:tcPr>
-            <w:vAlign w:val="center"/>
-          </w:tcPr>
-          <w:p>
-            <w:pPr>
-              <w:pStyle w:val="Compact"/>
-              <w:jc w:val="center"/>
-            </w:pPr>
-            <w:r>
-              <w:rPr>
-                <w:sz w:val="20"/>
-              </w:rPr>
-              <w:t xml:space="preserve"> </w:t>
-            </w:r>
-          </w:p>
-        </w:tc>
-        <w:tc>
-          <w:tcPr>
-            <w:vAlign w:val="center"/>
-          </w:tcPr>
-          <w:p>
-            <w:pPr>
-              <w:pStyle w:val="Compact"/>
-              <w:jc w:val="center"/>
-            </w:pPr>
-            <w:r>
-              <w:rPr>
-                <w:sz w:val="20"/>
-              </w:rPr>
-              <w:t xml:space="preserve"> </w:t>
-            </w:r>
-          </w:p>
-        </w:tc>
-        <w:tc>
-          <w:tcPr>
-            <w:vAlign w:val="center"/>
-          </w:tcPr>
-          <w:p>
-            <w:pPr>
-              <w:pStyle w:val="Compact"/>
-              <w:jc w:val="center"/>
-            </w:pPr>
-            <w:r>
-              <w:rPr>
-                <w:sz w:val="20"/>
-              </w:rPr>
-              <w:t xml:space="preserve"> </w:t>
-            </w:r>
-          </w:p>
-        </w:tc>
-        <w:tc>
-          <w:tcPr>
-            <w:vAlign w:val="center"/>
-          </w:tcPr>
-          <w:p>
-            <w:pPr>
-              <w:pStyle w:val="Compact"/>
-              <w:jc w:val="center"/>
-            </w:pPr>
-            <w:r>
-              <w:rPr>
-                <w:sz w:val="20"/>
-              </w:rPr>
-              <w:t xml:space="preserve"> </w:t>
-            </w:r>
-          </w:p>
-        </w:tc>
       </w:tr>
       <w:tr>
         <w:trPr>
           <w:trHeight w:val="425" w:hRule="atLeast"/>
         </w:trPr>
-        <w:tc>
-          <w:tcPr>
-            <w:vAlign w:val="center"/>
-          </w:tcPr>
-          <w:p>
-            <w:pPr>
-              <w:pStyle w:val="Compact"/>
-              <w:jc w:val="center"/>
-            </w:pPr>
-            <w:r>
-              <w:rPr>
-                <w:sz w:val="20"/>
-              </w:rPr>
-              <w:t xml:space="preserve"> </w:t>
-            </w:r>
-          </w:p>
-        </w:tc>
-        <w:tc>
-          <w:tcPr>
-            <w:vAlign w:val="center"/>
-          </w:tcPr>
-          <w:p>
-            <w:pPr>
-              <w:pStyle w:val="Compact"/>
-              <w:jc w:val="center"/>
-            </w:pPr>
-            <w:r>
-              <w:rPr>
-                <w:sz w:val="20"/>
-              </w:rPr>
-              <w:t xml:space="preserve"> </w:t>
-            </w:r>
-          </w:p>
-        </w:tc>
-        <w:tc>
-          <w:tcPr>
-            <w:vAlign w:val="center"/>
-          </w:tcPr>
-          <w:p>
-            <w:pPr>
-              <w:pStyle w:val="Compact"/>
-              <w:jc w:val="center"/>
-            </w:pPr>
-            <w:r>
-              <w:rPr>
-                <w:sz w:val="20"/>
-              </w:rPr>
-              <w:t xml:space="preserve"> </w:t>
-            </w:r>
-          </w:p>
-        </w:tc>
-        <w:tc>
-          <w:tcPr>
-            <w:vAlign w:val="center"/>
-          </w:tcPr>
-          <w:p>
-            <w:pPr>
-              <w:pStyle w:val="Compact"/>
-              <w:jc w:val="center"/>
-            </w:pPr>
-            <w:r>
-              <w:rPr>
-                <w:sz w:val="20"/>
-              </w:rPr>
-              <w:t xml:space="preserve"> </w:t>
-            </w:r>
-          </w:p>
-        </w:tc>
         <w:tc>
           <w:tcPr>
             <w:vAlign w:val="center"/>
@@ -4108,7 +3357,7 @@
         <w:t xml:space="preserve"> </w:t>
       </w:r>
       <w:r>
-        <w:t xml:space="preserve">Inserte la gráfica de</w:t>
+        <w:t xml:space="preserve">Represente</w:t>
       </w:r>
       <w:r>
         <w:t xml:space="preserve"> </w:t>
@@ -4150,7 +3399,7 @@
         <w:t xml:space="preserve"> </w:t>
       </w:r>
       <w:r>
-        <w:t xml:space="preserve">(Tabla 1) con la recta de ajuste lineal.</w:t>
+        <w:t xml:space="preserve">con sus barras de error y la recta de ajuste por mínimos cuadrados.</w:t>
       </w:r>
     </w:p>
     <w:tbl>
@@ -4212,12 +3461,151 @@
         <w:t xml:space="preserve"> </w:t>
       </w:r>
       <w:r>
-        <w:t xml:space="preserve">Calcule la pendiente, la ordenada en el origen, sus errores y el coeficiente de correlación lineal mediante ajuste por mínimos cuadrados.</w:t>
+        <w:t xml:space="preserve">Con la pendiente</w:t>
+      </w:r>
+      <w:r>
+        <w:t xml:space="preserve"> </w:t>
+      </w:r>
+      <m:oMath>
+        <m:r>
+          <m:t>B</m:t>
+        </m:r>
+      </m:oMath>
+      <w:r>
+        <w:t xml:space="preserve"> </w:t>
+      </w:r>
+      <w:r>
+        <w:t xml:space="preserve">del ajuste, obtenga</w:t>
+      </w:r>
+      <w:r>
+        <w:t xml:space="preserve"> </w:t>
+      </w:r>
+      <m:oMath>
+        <m:r>
+          <m:t>g</m:t>
+        </m:r>
+        <m:r>
+          <m:rPr>
+            <m:sty m:val="p"/>
+          </m:rPr>
+          <m:t>=</m:t>
+        </m:r>
+        <m:r>
+          <m:t>4</m:t>
+        </m:r>
+        <m:sSup>
+          <m:e>
+            <m:r>
+              <m:t>π</m:t>
+            </m:r>
+          </m:e>
+          <m:sup>
+            <m:r>
+              <m:t>2</m:t>
+            </m:r>
+          </m:sup>
+        </m:sSup>
+        <m:r>
+          <m:rPr>
+            <m:sty m:val="p"/>
+          </m:rPr>
+          <m:t>/</m:t>
+        </m:r>
+        <m:r>
+          <m:t>B</m:t>
+        </m:r>
+      </m:oMath>
+      <w:r>
+        <w:t xml:space="preserve"> </w:t>
+      </w:r>
+      <w:r>
+        <w:t xml:space="preserve">con su error y compárelo con 9,81 m/s².</w:t>
+      </w:r>
+    </w:p>
+    <w:p>
+      <w:pPr>
+        <w:pStyle w:val="BodyText"/>
+        <w:spacing w:after="120" w:line="276" w:lineRule="auto"/>
+        <w:jc w:val="both"/>
+      </w:pPr>
+      <w:r>
+        <w:t xml:space="preserve">Para compararlo con el valor de referencia, calcule la diferencia</w:t>
+      </w:r>
+      <w:r>
+        <w:t xml:space="preserve"> </w:t>
+      </w:r>
+      <m:oMath>
+        <m:d>
+          <m:dPr>
+            <m:begChr m:val="|"/>
+            <m:endChr m:val="|"/>
+            <m:sepChr m:val=""/>
+            <m:grow/>
+          </m:dPr>
+          <m:e>
+            <m:r>
+              <m:t>g</m:t>
+            </m:r>
+            <m:r>
+              <m:rPr>
+                <m:sty m:val="p"/>
+              </m:rPr>
+              <m:t>−</m:t>
+            </m:r>
+            <m:r>
+              <m:t>9</m:t>
+            </m:r>
+            <m:r>
+              <m:rPr>
+                <m:sty m:val="p"/>
+              </m:rPr>
+              <m:t>,</m:t>
+            </m:r>
+            <m:r>
+              <m:t>81</m:t>
+            </m:r>
+          </m:e>
+        </m:d>
+      </m:oMath>
+      <w:r>
+        <w:t xml:space="preserve">. Si es menor que el error</w:t>
+      </w:r>
+      <w:r>
+        <w:t xml:space="preserve"> </w:t>
+      </w:r>
+      <m:oMath>
+        <m:sSub>
+          <m:e>
+            <m:r>
+              <m:t>ε</m:t>
+            </m:r>
+          </m:e>
+          <m:sub>
+            <m:r>
+              <m:t>g</m:t>
+            </m:r>
+          </m:sub>
+        </m:sSub>
+      </m:oMath>
+      <w:r>
+        <w:t xml:space="preserve">, su medida es compatible con 9,81 m/s²; escriba «sí» o «no» en la última columna.</w:t>
+      </w:r>
+    </w:p>
+    <w:p>
+      <w:pPr>
+        <w:pStyle w:val="TableCaption"/>
+        <w:keepNext/>
+        <w:spacing w:before="200" w:after="80"/>
+        <w:jc w:val="center"/>
+      </w:pPr>
+      <w:r>
+        <w:t xml:space="preserve">Tabla 3. Ajuste lineal y aceleración de la gravedad.</w:t>
       </w:r>
     </w:p>
     <w:tbl>
       <w:tblPr>
         <w:tblW w:type="pct" w:w="5000"/>
+        <w:jc w:val="center"/>
         <w:tblBorders>
           <w:top w:val="single" w:sz="6" w:color="000000"/>
           <w:left w:val="single" w:sz="6" w:color="000000"/>
@@ -4226,28 +3614,344 @@
           <w:insideH w:val="single" w:sz="6" w:color="000000"/>
           <w:insideV w:val="single" w:sz="6" w:color="000000"/>
         </w:tblBorders>
-        <w:tblLook w:firstColumn="1" w:firstRow="1" w:lastColumn="0" w:lastRow="0" w:noHBand="0" w:noVBand="1" w:val="04A0"/>
+        <w:tblLook w:firstRow="1" w:lastRow="0" w:firstColumn="0" w:lastColumn="0" w:noHBand="0" w:noVBand="0" w:val="0020"/>
+        <w:tblCaption w:val="Tabla 3. Ajuste lineal y aceleración de la gravedad."/>
       </w:tblPr>
       <w:tblGrid>
-        <w:gridCol w:w="9524"/>
+        <w:gridCol w:w="1320"/>
+        <w:gridCol w:w="1320"/>
+        <w:gridCol w:w="1320"/>
+        <w:gridCol w:w="1320"/>
+        <w:gridCol w:w="1320"/>
+        <w:gridCol w:w="1320"/>
       </w:tblGrid>
       <w:tr>
         <w:trPr>
-          <w:trHeight w:val="1134" w:hRule="atLeast"/>
+          <w:trHeight w:val="510" w:hRule="atLeast"/>
+          <w:tblHeader w:val="true"/>
         </w:trPr>
         <w:tc>
           <w:tcPr>
-            <w:tcW w:type="dxa" w:w="9524"/>
-          </w:tcPr>
-          <w:p/>
+            <w:shd w:val="clear" w:color="auto" w:fill="FFF0C1"/>
+            <w:vAlign w:val="center"/>
+          </w:tcPr>
+          <w:p>
+            <w:pPr>
+              <w:pStyle w:val="Compact"/>
+              <w:keepNext/>
+              <w:jc w:val="center"/>
+            </w:pPr>
+            <m:oMath>
+              <m:r>
+                <m:t>B</m:t>
+              </m:r>
+            </m:oMath>
+            <w:r>
+              <w:rPr>
+                <w:sz w:val="20"/>
+              </w:rPr>
+              <w:t xml:space="preserve"> </w:t>
+            </w:r>
+            <w:r>
+              <w:rPr>
+                <w:sz w:val="20"/>
+              </w:rPr>
+              <w:t xml:space="preserve">(s²/m)</w:t>
+            </w:r>
+          </w:p>
+        </w:tc>
+        <w:tc>
+          <w:tcPr>
+            <w:shd w:val="clear" w:color="auto" w:fill="FFF0C1"/>
+            <w:vAlign w:val="center"/>
+          </w:tcPr>
+          <w:p>
+            <w:pPr>
+              <w:pStyle w:val="Compact"/>
+              <w:keepNext/>
+              <w:jc w:val="center"/>
+            </w:pPr>
+            <m:oMath>
+              <m:r>
+                <m:t>A</m:t>
+              </m:r>
+            </m:oMath>
+            <w:r>
+              <w:rPr>
+                <w:sz w:val="20"/>
+              </w:rPr>
+              <w:t xml:space="preserve"> </w:t>
+            </w:r>
+            <w:r>
+              <w:rPr>
+                <w:sz w:val="20"/>
+              </w:rPr>
+              <w:t xml:space="preserve">(s²)</w:t>
+            </w:r>
+          </w:p>
+        </w:tc>
+        <w:tc>
+          <w:tcPr>
+            <w:shd w:val="clear" w:color="auto" w:fill="FFF0C1"/>
+            <w:vAlign w:val="center"/>
+          </w:tcPr>
+          <w:p>
+            <w:pPr>
+              <w:pStyle w:val="Compact"/>
+              <w:keepNext/>
+              <w:jc w:val="center"/>
+            </w:pPr>
+            <m:oMath>
+              <m:r>
+                <m:t>r</m:t>
+              </m:r>
+            </m:oMath>
+          </w:p>
+        </w:tc>
+        <w:tc>
+          <w:tcPr>
+            <w:shd w:val="clear" w:color="auto" w:fill="FFF0C1"/>
+            <w:vAlign w:val="center"/>
+          </w:tcPr>
+          <w:p>
+            <w:pPr>
+              <w:pStyle w:val="Compact"/>
+              <w:keepNext/>
+              <w:jc w:val="center"/>
+            </w:pPr>
+            <m:oMath>
+              <m:r>
+                <m:t>g</m:t>
+              </m:r>
+              <m:r>
+                <m:rPr>
+                  <m:sty m:val="p"/>
+                </m:rPr>
+                <m:t>±</m:t>
+              </m:r>
+              <m:sSub>
+                <m:e>
+                  <m:r>
+                    <m:t>ε</m:t>
+                  </m:r>
+                </m:e>
+                <m:sub>
+                  <m:r>
+                    <m:t>g</m:t>
+                  </m:r>
+                </m:sub>
+              </m:sSub>
+            </m:oMath>
+            <w:r>
+              <w:rPr>
+                <w:sz w:val="20"/>
+              </w:rPr>
+              <w:t xml:space="preserve"> </w:t>
+            </w:r>
+            <w:r>
+              <w:rPr>
+                <w:sz w:val="20"/>
+              </w:rPr>
+              <w:t xml:space="preserve">(m/s²)</w:t>
+            </w:r>
+          </w:p>
+        </w:tc>
+        <w:tc>
+          <w:tcPr>
+            <w:shd w:val="clear" w:color="auto" w:fill="FFF0C1"/>
+            <w:vAlign w:val="center"/>
+          </w:tcPr>
+          <w:p>
+            <w:pPr>
+              <w:pStyle w:val="Compact"/>
+              <w:keepNext/>
+              <w:jc w:val="center"/>
+            </w:pPr>
+            <m:oMath>
+              <m:d>
+                <m:dPr>
+                  <m:begChr m:val="|"/>
+                  <m:endChr m:val="|"/>
+                  <m:sepChr m:val=""/>
+                  <m:grow/>
+                </m:dPr>
+                <m:e>
+                  <m:r>
+                    <m:t>g</m:t>
+                  </m:r>
+                  <m:r>
+                    <m:rPr>
+                      <m:sty m:val="p"/>
+                    </m:rPr>
+                    <m:t>−</m:t>
+                  </m:r>
+                  <m:r>
+                    <m:t>9</m:t>
+                  </m:r>
+                  <m:r>
+                    <m:rPr>
+                      <m:sty m:val="p"/>
+                    </m:rPr>
+                    <m:t>,</m:t>
+                  </m:r>
+                  <m:r>
+                    <m:t>81</m:t>
+                  </m:r>
+                </m:e>
+              </m:d>
+            </m:oMath>
+            <w:r>
+              <w:rPr>
+                <w:sz w:val="20"/>
+              </w:rPr>
+              <w:t xml:space="preserve"> </w:t>
+            </w:r>
+            <w:r>
+              <w:rPr>
+                <w:sz w:val="20"/>
+              </w:rPr>
+              <w:t xml:space="preserve">(m/s²)</w:t>
+            </w:r>
+          </w:p>
+        </w:tc>
+        <w:tc>
+          <w:tcPr>
+            <w:shd w:val="clear" w:color="auto" w:fill="FFF0C1"/>
+            <w:vAlign w:val="center"/>
+          </w:tcPr>
+          <w:p>
+            <w:pPr>
+              <w:pStyle w:val="Compact"/>
+              <w:keepNext/>
+              <w:jc w:val="center"/>
+            </w:pPr>
+            <w:r>
+              <w:rPr>
+                <w:sz w:val="20"/>
+              </w:rPr>
+              <w:t xml:space="preserve">¿Compatible?</w:t>
+            </w:r>
+          </w:p>
+        </w:tc>
+      </w:tr>
+      <w:tr>
+        <w:trPr>
+          <w:trHeight w:val="425" w:hRule="atLeast"/>
+        </w:trPr>
+        <w:tc>
+          <w:tcPr>
+            <w:vAlign w:val="center"/>
+          </w:tcPr>
+          <w:p>
+            <w:pPr>
+              <w:pStyle w:val="Compact"/>
+              <w:keepNext/>
+              <w:jc w:val="center"/>
+            </w:pPr>
+            <w:r>
+              <w:rPr>
+                <w:sz w:val="20"/>
+              </w:rPr>
+              <w:t xml:space="preserve"> </w:t>
+            </w:r>
+          </w:p>
+        </w:tc>
+        <w:tc>
+          <w:tcPr>
+            <w:vAlign w:val="center"/>
+          </w:tcPr>
+          <w:p>
+            <w:pPr>
+              <w:pStyle w:val="Compact"/>
+              <w:keepNext/>
+              <w:jc w:val="center"/>
+            </w:pPr>
+            <w:r>
+              <w:rPr>
+                <w:sz w:val="20"/>
+              </w:rPr>
+              <w:t xml:space="preserve"> </w:t>
+            </w:r>
+          </w:p>
+        </w:tc>
+        <w:tc>
+          <w:tcPr>
+            <w:vAlign w:val="center"/>
+          </w:tcPr>
+          <w:p>
+            <w:pPr>
+              <w:pStyle w:val="Compact"/>
+              <w:keepNext/>
+              <w:jc w:val="center"/>
+            </w:pPr>
+            <w:r>
+              <w:rPr>
+                <w:sz w:val="20"/>
+              </w:rPr>
+              <w:t xml:space="preserve"> </w:t>
+            </w:r>
+          </w:p>
+        </w:tc>
+        <w:tc>
+          <w:tcPr>
+            <w:vAlign w:val="center"/>
+          </w:tcPr>
+          <w:p>
+            <w:pPr>
+              <w:pStyle w:val="Compact"/>
+              <w:keepNext/>
+              <w:jc w:val="center"/>
+            </w:pPr>
+            <w:r>
+              <w:rPr>
+                <w:sz w:val="20"/>
+              </w:rPr>
+              <w:t xml:space="preserve"> </w:t>
+            </w:r>
+          </w:p>
+        </w:tc>
+        <w:tc>
+          <w:tcPr>
+            <w:vAlign w:val="center"/>
+          </w:tcPr>
+          <w:p>
+            <w:pPr>
+              <w:pStyle w:val="Compact"/>
+              <w:keepNext/>
+              <w:jc w:val="center"/>
+            </w:pPr>
+            <w:r>
+              <w:rPr>
+                <w:sz w:val="20"/>
+              </w:rPr>
+              <w:t xml:space="preserve"> </w:t>
+            </w:r>
+          </w:p>
+        </w:tc>
+        <w:tc>
+          <w:tcPr>
+            <w:vAlign w:val="center"/>
+          </w:tcPr>
+          <w:p>
+            <w:pPr>
+              <w:pStyle w:val="Compact"/>
+              <w:keepNext/>
+              <w:jc w:val="center"/>
+            </w:pPr>
+            <w:r>
+              <w:rPr>
+                <w:sz w:val="20"/>
+              </w:rPr>
+              <w:t xml:space="preserve"> </w:t>
+            </w:r>
+          </w:p>
         </w:tc>
       </w:tr>
     </w:tbl>
-    <w:p/>
     <w:p>
       <w:pPr>
         <w:pStyle w:val="BodyText"/>
-        <w:spacing w:before="280" w:after="120" w:line="276" w:lineRule="auto"/>
+        <w:spacing w:before="200" w:after="120" w:line="276" w:lineRule="auto"/>
         <w:jc w:val="both"/>
       </w:pPr>
       <w:r>
@@ -4261,91 +3965,7 @@
         <w:t xml:space="preserve"> </w:t>
       </w:r>
       <w:r>
-        <w:t xml:space="preserve">Con la pendiente obtenga</w:t>
-      </w:r>
-      <w:r>
-        <w:t xml:space="preserve"> </w:t>
-      </w:r>
-      <m:oMath>
-        <m:r>
-          <m:t>g</m:t>
-        </m:r>
-      </m:oMath>
-      <w:r>
-        <w:t xml:space="preserve"> </w:t>
-      </w:r>
-      <w:r>
-        <w:t xml:space="preserve">con su error y compárelo con</w:t>
-      </w:r>
-      <w:r>
-        <w:t xml:space="preserve"> </w:t>
-      </w:r>
-      <m:oMath>
-        <m:r>
-          <m:t>g</m:t>
-        </m:r>
-        <m:r>
-          <m:rPr>
-            <m:sty m:val="p"/>
-          </m:rPr>
-          <m:t>=</m:t>
-        </m:r>
-        <m:r>
-          <m:t>9</m:t>
-        </m:r>
-        <m:r>
-          <m:rPr>
-            <m:sty m:val="p"/>
-          </m:rPr>
-          <m:t>,</m:t>
-        </m:r>
-        <m:r>
-          <m:t>81</m:t>
-        </m:r>
-      </m:oMath>
-      <w:r>
-        <w:t xml:space="preserve"> </w:t>
-      </w:r>
-      <w:r>
-        <w:t xml:space="preserve">m/s².</w:t>
-      </w:r>
-    </w:p>
-    <w:p>
-      <w:pPr>
-        <w:pStyle w:val="BodyText"/>
-        <w:spacing w:after="120" w:line="276" w:lineRule="auto"/>
-        <w:jc w:val="both"/>
-      </w:pPr>
-      <m:oMath>
-        <m:r>
-          <m:t>g</m:t>
-        </m:r>
-      </m:oMath>
-      <w:r>
-        <w:t xml:space="preserve"> </w:t>
-      </w:r>
-      <w:r>
-        <w:t xml:space="preserve">= ( __________ ± __________ ) m/s²</w:t>
-      </w:r>
-    </w:p>
-    <w:p>
-      <w:pPr>
-        <w:pStyle w:val="BodyText"/>
-        <w:spacing w:before="280" w:after="120" w:line="276" w:lineRule="auto"/>
-        <w:jc w:val="both"/>
-      </w:pPr>
-      <w:r>
-        <w:rPr>
-          <w:bCs/>
-          <w:b/>
-        </w:rPr>
-        <w:t xml:space="preserve">4.</w:t>
-      </w:r>
-      <w:r>
-        <w:t xml:space="preserve"> </w:t>
-      </w:r>
-      <w:r>
-        <w:t xml:space="preserve">Inserte la gráfica de</w:t>
+        <w:t xml:space="preserve">En la Tabla 2, ¿coinciden el cociente</w:t>
       </w:r>
       <w:r>
         <w:t xml:space="preserve"> </w:t>
@@ -4377,149 +3997,21 @@
         <w:t xml:space="preserve"> </w:t>
       </w:r>
       <w:r>
-        <w:t xml:space="preserve">frente a</w:t>
+        <w:t xml:space="preserve">medido y el teórico? Escriba el primer valor de</w:t>
       </w:r>
       <w:r>
         <w:t xml:space="preserve"> </w:t>
       </w:r>
       <m:oMath>
-        <m:sSubSup>
-          <m:e>
-            <m:r>
-              <m:t>θ</m:t>
-            </m:r>
-          </m:e>
-          <m:sub>
-            <m:r>
-              <m:t>0</m:t>
-            </m:r>
-          </m:sub>
-          <m:sup>
-            <m:r>
-              <m:t>2</m:t>
-            </m:r>
-          </m:sup>
-        </m:sSubSup>
+        <m:r>
+          <m:t>x</m:t>
+        </m:r>
       </m:oMath>
       <w:r>
         <w:t xml:space="preserve"> </w:t>
       </w:r>
       <w:r>
-        <w:t xml:space="preserve">(Tabla 2) con la recta de ajuste.</w:t>
-      </w:r>
-    </w:p>
-    <w:tbl>
-      <w:tblPr>
-        <w:tblW w:type="pct" w:w="5000"/>
-        <w:tblBorders>
-          <w:top w:val="single" w:sz="6" w:color="000000"/>
-          <w:left w:val="single" w:sz="6" w:color="000000"/>
-          <w:bottom w:val="single" w:sz="6" w:color="000000"/>
-          <w:right w:val="single" w:sz="6" w:color="000000"/>
-          <w:insideH w:val="single" w:sz="6" w:color="000000"/>
-          <w:insideV w:val="single" w:sz="6" w:color="000000"/>
-        </w:tblBorders>
-        <w:tblLook w:firstColumn="1" w:firstRow="1" w:lastColumn="0" w:lastRow="0" w:noHBand="0" w:noVBand="1" w:val="04A0"/>
-      </w:tblPr>
-      <w:tblGrid>
-        <w:gridCol w:w="9524"/>
-      </w:tblGrid>
-      <w:tr>
-        <w:trPr>
-          <w:trHeight w:val="5103" w:hRule="atLeast"/>
-        </w:trPr>
-        <w:tc>
-          <w:tcPr>
-            <w:tcW w:type="dxa" w:w="9524"/>
-            <w:vAlign w:val="center"/>
-          </w:tcPr>
-          <w:p>
-            <w:pPr>
-              <w:jc w:val="center"/>
-            </w:pPr>
-            <w:r>
-              <w:rPr>
-                <w:i/>
-                <w:color w:val="999999"/>
-                <w:sz w:val="20"/>
-              </w:rPr>
-              <w:t>Pegue aquí la gráfica</w:t>
-            </w:r>
-          </w:p>
-        </w:tc>
-      </w:tr>
-    </w:tbl>
-    <w:p/>
-    <w:p>
-      <w:pPr>
-        <w:pStyle w:val="BodyText"/>
-        <w:spacing w:before="280" w:after="120" w:line="276" w:lineRule="auto"/>
-        <w:jc w:val="both"/>
-      </w:pPr>
-      <w:r>
-        <w:rPr>
-          <w:bCs/>
-          <w:b/>
-        </w:rPr>
-        <w:t xml:space="preserve">5.</w:t>
-      </w:r>
-      <w:r>
-        <w:t xml:space="preserve"> </w:t>
-      </w:r>
-      <w:r>
-        <w:t xml:space="preserve">Obtenga la pendiente con su error y compárela con el valor teórico</w:t>
-      </w:r>
-      <w:r>
-        <w:t xml:space="preserve"> </w:t>
-      </w:r>
-      <m:oMath>
-        <m:r>
-          <m:t>1</m:t>
-        </m:r>
-        <m:r>
-          <m:rPr>
-            <m:sty m:val="p"/>
-          </m:rPr>
-          <m:t>/</m:t>
-        </m:r>
-        <m:r>
-          <m:t>16</m:t>
-        </m:r>
-        <m:r>
-          <m:rPr>
-            <m:sty m:val="p"/>
-          </m:rPr>
-          <m:t>=</m:t>
-        </m:r>
-        <m:r>
-          <m:t>0</m:t>
-        </m:r>
-        <m:r>
-          <m:rPr>
-            <m:sty m:val="p"/>
-          </m:rPr>
-          <m:t>,</m:t>
-        </m:r>
-        <m:r>
-          <m:t>0625</m:t>
-        </m:r>
-      </m:oMath>
-      <w:r>
-        <w:t xml:space="preserve">. ¿A partir de qué amplitud la diferencia entre</w:t>
-      </w:r>
-      <w:r>
-        <w:t xml:space="preserve"> </w:t>
-      </w:r>
-      <m:oMath>
-        <m:r>
-          <m:t>T</m:t>
-        </m:r>
-      </m:oMath>
-      <w:r>
-        <w:t xml:space="preserve"> </w:t>
-      </w:r>
-      <w:r>
-        <w:t xml:space="preserve">y</w:t>
+        <w:t xml:space="preserve">para el que el periodo medido supera a</w:t>
       </w:r>
       <w:r>
         <w:t xml:space="preserve"> </w:t>
@@ -4542,12 +4034,94 @@
         <w:t xml:space="preserve"> </w:t>
       </w:r>
       <w:r>
-        <w:t xml:space="preserve">supera el error de sus medidas?</w:t>
+        <w:t xml:space="preserve">en más de un 1 %, es decir,</w:t>
+      </w:r>
+      <w:r>
+        <w:t xml:space="preserve"> </w:t>
+      </w:r>
+      <m:oMath>
+        <m:r>
+          <m:t>T</m:t>
+        </m:r>
+        <m:r>
+          <m:rPr>
+            <m:sty m:val="p"/>
+          </m:rPr>
+          <m:t>/</m:t>
+        </m:r>
+        <m:sSub>
+          <m:e>
+            <m:r>
+              <m:t>T</m:t>
+            </m:r>
+          </m:e>
+          <m:sub>
+            <m:r>
+              <m:t>0</m:t>
+            </m:r>
+          </m:sub>
+        </m:sSub>
+        <m:r>
+          <m:rPr>
+            <m:sty m:val="p"/>
+          </m:rPr>
+          <m:t>&gt;</m:t>
+        </m:r>
+        <m:r>
+          <m:t>1</m:t>
+        </m:r>
+        <m:r>
+          <m:rPr>
+            <m:sty m:val="p"/>
+          </m:rPr>
+          <m:t>,</m:t>
+        </m:r>
+        <m:r>
+          <m:t>01</m:t>
+        </m:r>
+      </m:oMath>
+      <w:r>
+        <w:t xml:space="preserve">, y su ángulo</w:t>
+      </w:r>
+      <w:r>
+        <w:t xml:space="preserve"> </w:t>
+      </w:r>
+      <m:oMath>
+        <m:sSub>
+          <m:e>
+            <m:r>
+              <m:t>θ</m:t>
+            </m:r>
+          </m:e>
+          <m:sub>
+            <m:r>
+              <m:t>0</m:t>
+            </m:r>
+          </m:sub>
+        </m:sSub>
+      </m:oMath>
+      <w:r>
+        <w:t xml:space="preserve"> </w:t>
+      </w:r>
+      <w:r>
+        <w:t xml:space="preserve">en grados.</w:t>
+      </w:r>
+    </w:p>
+    <w:p>
+      <w:pPr>
+        <w:pStyle w:val="TableCaption"/>
+        <w:keepNext/>
+        <w:spacing w:before="200" w:after="80"/>
+        <w:jc w:val="center"/>
+      </w:pPr>
+      <w:r>
+        <w:t xml:space="preserve">Tabla 4. Amplitud a partir de la cual el periodo crece más de un 1 %.</w:t>
       </w:r>
     </w:p>
     <w:tbl>
       <w:tblPr>
         <w:tblW w:type="pct" w:w="5000"/>
+        <w:jc w:val="center"/>
         <w:tblBorders>
           <w:top w:val="single" w:sz="6" w:color="000000"/>
           <w:left w:val="single" w:sz="6" w:color="000000"/>
@@ -4556,24 +4130,130 @@
           <w:insideH w:val="single" w:sz="6" w:color="000000"/>
           <w:insideV w:val="single" w:sz="6" w:color="000000"/>
         </w:tblBorders>
-        <w:tblLook w:firstColumn="1" w:firstRow="1" w:lastColumn="0" w:lastRow="0" w:noHBand="0" w:noVBand="1" w:val="04A0"/>
+        <w:tblLook w:firstRow="1" w:lastRow="0" w:firstColumn="0" w:lastColumn="0" w:noHBand="0" w:noVBand="0" w:val="0020"/>
+        <w:tblCaption w:val="Tabla 4. Amplitud a partir de la cual el periodo crece más de un 1 %."/>
       </w:tblPr>
       <w:tblGrid>
-        <w:gridCol w:w="9524"/>
+        <w:gridCol w:w="3960"/>
+        <w:gridCol w:w="3960"/>
       </w:tblGrid>
       <w:tr>
         <w:trPr>
-          <w:trHeight w:val="1701" w:hRule="atLeast"/>
+          <w:trHeight w:val="510" w:hRule="atLeast"/>
+          <w:tblHeader w:val="true"/>
         </w:trPr>
         <w:tc>
           <w:tcPr>
-            <w:tcW w:type="dxa" w:w="9524"/>
-          </w:tcPr>
-          <w:p/>
+            <w:shd w:val="clear" w:color="auto" w:fill="FFF0C1"/>
+            <w:vAlign w:val="center"/>
+          </w:tcPr>
+          <w:p>
+            <w:pPr>
+              <w:pStyle w:val="Compact"/>
+              <w:keepNext/>
+              <w:jc w:val="center"/>
+            </w:pPr>
+            <m:oMath>
+              <m:r>
+                <m:t>x</m:t>
+              </m:r>
+            </m:oMath>
+            <w:r>
+              <w:rPr>
+                <w:sz w:val="20"/>
+              </w:rPr>
+              <w:t xml:space="preserve"> </w:t>
+            </w:r>
+            <w:r>
+              <w:rPr>
+                <w:sz w:val="20"/>
+              </w:rPr>
+              <w:t xml:space="preserve">(m)</w:t>
+            </w:r>
+          </w:p>
+        </w:tc>
+        <w:tc>
+          <w:tcPr>
+            <w:shd w:val="clear" w:color="auto" w:fill="FFF0C1"/>
+            <w:vAlign w:val="center"/>
+          </w:tcPr>
+          <w:p>
+            <w:pPr>
+              <w:pStyle w:val="Compact"/>
+              <w:keepNext/>
+              <w:jc w:val="center"/>
+            </w:pPr>
+            <m:oMath>
+              <m:sSub>
+                <m:e>
+                  <m:r>
+                    <m:t>θ</m:t>
+                  </m:r>
+                </m:e>
+                <m:sub>
+                  <m:r>
+                    <m:t>0</m:t>
+                  </m:r>
+                </m:sub>
+              </m:sSub>
+            </m:oMath>
+            <w:r>
+              <w:rPr>
+                <w:sz w:val="20"/>
+              </w:rPr>
+              <w:t xml:space="preserve"> </w:t>
+            </w:r>
+            <w:r>
+              <w:rPr>
+                <w:sz w:val="20"/>
+              </w:rPr>
+              <w:t xml:space="preserve">(grados)</w:t>
+            </w:r>
+          </w:p>
+        </w:tc>
+      </w:tr>
+      <w:tr>
+        <w:trPr>
+          <w:trHeight w:val="425" w:hRule="atLeast"/>
+        </w:trPr>
+        <w:tc>
+          <w:tcPr>
+            <w:vAlign w:val="center"/>
+          </w:tcPr>
+          <w:p>
+            <w:pPr>
+              <w:pStyle w:val="Compact"/>
+              <w:keepNext/>
+              <w:jc w:val="center"/>
+            </w:pPr>
+            <w:r>
+              <w:rPr>
+                <w:sz w:val="20"/>
+              </w:rPr>
+              <w:t xml:space="preserve"> </w:t>
+            </w:r>
+          </w:p>
+        </w:tc>
+        <w:tc>
+          <w:tcPr>
+            <w:vAlign w:val="center"/>
+          </w:tcPr>
+          <w:p>
+            <w:pPr>
+              <w:pStyle w:val="Compact"/>
+              <w:keepNext/>
+              <w:jc w:val="center"/>
+            </w:pPr>
+            <w:r>
+              <w:rPr>
+                <w:sz w:val="20"/>
+              </w:rPr>
+              <w:t xml:space="preserve"> </w:t>
+            </w:r>
+          </w:p>
         </w:tc>
       </w:tr>
     </w:tbl>
-    <w:p/>
     <w:bookmarkEnd w:id="30"/>
     <w:sectPr>
       <w:headerReference w:type="default" r:id="rId9"/>

</xml_diff>

<commit_message>
Fichas P1, P3, P4: sin indicar cómo sale la magnitud del ajuste
Co-Authored-By: Claude Opus 5.5 <noreply@anthropic.com>
Claude-Session: https://claude.ai/code/session_01GdrGkTkQ1SpY6BWmf3EBwF
</commit_message>
<xml_diff>
--- a/fichas/fai-pendulo-simple.docx
+++ b/fichas/fai-pendulo-simple.docx
@@ -474,7 +474,7 @@
         <w:jc w:val="both"/>
       </w:pPr>
       <w:r>
-        <w:t xml:space="preserve">de modo que al representar</w:t>
+        <w:t xml:space="preserve">de modo que</w:t>
       </w:r>
       <w:r>
         <w:t xml:space="preserve"> </w:t>
@@ -502,7 +502,7 @@
         <w:t xml:space="preserve"> </w:t>
       </w:r>
       <w:r>
-        <w:t xml:space="preserve">frente a</w:t>
+        <w:t xml:space="preserve">depende linealmente de</w:t>
       </w:r>
       <w:r>
         <w:t xml:space="preserve"> </w:t>
@@ -510,52 +510,6 @@
       <m:oMath>
         <m:r>
           <m:t>L</m:t>
-        </m:r>
-      </m:oMath>
-      <w:r>
-        <w:t xml:space="preserve"> </w:t>
-      </w:r>
-      <w:r>
-        <w:t xml:space="preserve">se obtiene una recta de pendiente</w:t>
-      </w:r>
-      <w:r>
-        <w:t xml:space="preserve"> </w:t>
-      </w:r>
-      <m:oMath>
-        <m:r>
-          <m:t>4</m:t>
-        </m:r>
-        <m:sSup>
-          <m:e>
-            <m:r>
-              <m:t>π</m:t>
-            </m:r>
-          </m:e>
-          <m:sup>
-            <m:r>
-              <m:t>2</m:t>
-            </m:r>
-          </m:sup>
-        </m:sSup>
-        <m:r>
-          <m:rPr>
-            <m:sty m:val="p"/>
-          </m:rPr>
-          <m:t>/</m:t>
-        </m:r>
-        <m:r>
-          <m:t>g</m:t>
-        </m:r>
-      </m:oMath>
-      <w:r>
-        <w:t xml:space="preserve">, y de ella se despeja</w:t>
-      </w:r>
-      <w:r>
-        <w:t xml:space="preserve"> </w:t>
-      </w:r>
-      <m:oMath>
-        <m:r>
-          <m:t>g</m:t>
         </m:r>
       </m:oMath>
       <w:r>
@@ -1048,6 +1002,7 @@
           <w:p>
             <w:pPr>
               <w:pStyle w:val="Compact"/>
+              <w:keepNext/>
               <w:jc w:val="center"/>
             </w:pPr>
             <m:oMath>
@@ -1077,6 +1032,7 @@
           <w:p>
             <w:pPr>
               <w:pStyle w:val="Compact"/>
+              <w:keepNext/>
               <w:jc w:val="center"/>
             </w:pPr>
             <m:oMath>
@@ -1115,6 +1071,7 @@
           <w:p>
             <w:pPr>
               <w:pStyle w:val="Compact"/>
+              <w:keepNext/>
               <w:jc w:val="center"/>
             </w:pPr>
             <m:oMath>
@@ -1153,6 +1110,7 @@
           <w:p>
             <w:pPr>
               <w:pStyle w:val="Compact"/>
+              <w:keepNext/>
               <w:jc w:val="center"/>
             </w:pPr>
             <m:oMath>
@@ -1191,6 +1149,7 @@
           <w:p>
             <w:pPr>
               <w:pStyle w:val="Compact"/>
+              <w:keepNext/>
               <w:jc w:val="center"/>
             </w:pPr>
             <m:oMath>
@@ -1229,6 +1188,7 @@
           <w:p>
             <w:pPr>
               <w:pStyle w:val="Compact"/>
+              <w:keepNext/>
               <w:jc w:val="center"/>
             </w:pPr>
             <m:oMath>
@@ -1267,6 +1227,7 @@
           <w:p>
             <w:pPr>
               <w:pStyle w:val="Compact"/>
+              <w:keepNext/>
               <w:jc w:val="center"/>
             </w:pPr>
             <m:oMath>
@@ -1305,6 +1266,7 @@
           <w:p>
             <w:pPr>
               <w:pStyle w:val="Compact"/>
+              <w:keepNext/>
               <w:jc w:val="center"/>
             </w:pPr>
             <m:oMath>
@@ -1352,125 +1314,133 @@
           <w:p>
             <w:pPr>
               <w:pStyle w:val="Compact"/>
-              <w:jc w:val="center"/>
-            </w:pPr>
-            <w:r>
-              <w:rPr>
-                <w:sz w:val="20"/>
-              </w:rPr>
-              <w:t xml:space="preserve"> </w:t>
-            </w:r>
-          </w:p>
-        </w:tc>
-        <w:tc>
-          <w:tcPr>
-            <w:vAlign w:val="center"/>
-          </w:tcPr>
-          <w:p>
-            <w:pPr>
-              <w:pStyle w:val="Compact"/>
-              <w:jc w:val="center"/>
-            </w:pPr>
-            <w:r>
-              <w:rPr>
-                <w:sz w:val="20"/>
-              </w:rPr>
-              <w:t xml:space="preserve"> </w:t>
-            </w:r>
-          </w:p>
-        </w:tc>
-        <w:tc>
-          <w:tcPr>
-            <w:vAlign w:val="center"/>
-          </w:tcPr>
-          <w:p>
-            <w:pPr>
-              <w:pStyle w:val="Compact"/>
-              <w:jc w:val="center"/>
-            </w:pPr>
-            <w:r>
-              <w:rPr>
-                <w:sz w:val="20"/>
-              </w:rPr>
-              <w:t xml:space="preserve"> </w:t>
-            </w:r>
-          </w:p>
-        </w:tc>
-        <w:tc>
-          <w:tcPr>
-            <w:vAlign w:val="center"/>
-          </w:tcPr>
-          <w:p>
-            <w:pPr>
-              <w:pStyle w:val="Compact"/>
-              <w:jc w:val="center"/>
-            </w:pPr>
-            <w:r>
-              <w:rPr>
-                <w:sz w:val="20"/>
-              </w:rPr>
-              <w:t xml:space="preserve"> </w:t>
-            </w:r>
-          </w:p>
-        </w:tc>
-        <w:tc>
-          <w:tcPr>
-            <w:vAlign w:val="center"/>
-          </w:tcPr>
-          <w:p>
-            <w:pPr>
-              <w:pStyle w:val="Compact"/>
-              <w:jc w:val="center"/>
-            </w:pPr>
-            <w:r>
-              <w:rPr>
-                <w:sz w:val="20"/>
-              </w:rPr>
-              <w:t xml:space="preserve"> </w:t>
-            </w:r>
-          </w:p>
-        </w:tc>
-        <w:tc>
-          <w:tcPr>
-            <w:vAlign w:val="center"/>
-          </w:tcPr>
-          <w:p>
-            <w:pPr>
-              <w:pStyle w:val="Compact"/>
-              <w:jc w:val="center"/>
-            </w:pPr>
-            <w:r>
-              <w:rPr>
-                <w:sz w:val="20"/>
-              </w:rPr>
-              <w:t xml:space="preserve"> </w:t>
-            </w:r>
-          </w:p>
-        </w:tc>
-        <w:tc>
-          <w:tcPr>
-            <w:vAlign w:val="center"/>
-          </w:tcPr>
-          <w:p>
-            <w:pPr>
-              <w:pStyle w:val="Compact"/>
-              <w:jc w:val="center"/>
-            </w:pPr>
-            <w:r>
-              <w:rPr>
-                <w:sz w:val="20"/>
-              </w:rPr>
-              <w:t xml:space="preserve"> </w:t>
-            </w:r>
-          </w:p>
-        </w:tc>
-        <w:tc>
-          <w:tcPr>
-            <w:vAlign w:val="center"/>
-          </w:tcPr>
-          <w:p>
-            <w:pPr>
-              <w:pStyle w:val="Compact"/>
+              <w:keepNext/>
+              <w:jc w:val="center"/>
+            </w:pPr>
+            <w:r>
+              <w:rPr>
+                <w:sz w:val="20"/>
+              </w:rPr>
+              <w:t xml:space="preserve"> </w:t>
+            </w:r>
+          </w:p>
+        </w:tc>
+        <w:tc>
+          <w:tcPr>
+            <w:vAlign w:val="center"/>
+          </w:tcPr>
+          <w:p>
+            <w:pPr>
+              <w:pStyle w:val="Compact"/>
+              <w:keepNext/>
+              <w:jc w:val="center"/>
+            </w:pPr>
+            <w:r>
+              <w:rPr>
+                <w:sz w:val="20"/>
+              </w:rPr>
+              <w:t xml:space="preserve"> </w:t>
+            </w:r>
+          </w:p>
+        </w:tc>
+        <w:tc>
+          <w:tcPr>
+            <w:vAlign w:val="center"/>
+          </w:tcPr>
+          <w:p>
+            <w:pPr>
+              <w:pStyle w:val="Compact"/>
+              <w:keepNext/>
+              <w:jc w:val="center"/>
+            </w:pPr>
+            <w:r>
+              <w:rPr>
+                <w:sz w:val="20"/>
+              </w:rPr>
+              <w:t xml:space="preserve"> </w:t>
+            </w:r>
+          </w:p>
+        </w:tc>
+        <w:tc>
+          <w:tcPr>
+            <w:vAlign w:val="center"/>
+          </w:tcPr>
+          <w:p>
+            <w:pPr>
+              <w:pStyle w:val="Compact"/>
+              <w:keepNext/>
+              <w:jc w:val="center"/>
+            </w:pPr>
+            <w:r>
+              <w:rPr>
+                <w:sz w:val="20"/>
+              </w:rPr>
+              <w:t xml:space="preserve"> </w:t>
+            </w:r>
+          </w:p>
+        </w:tc>
+        <w:tc>
+          <w:tcPr>
+            <w:vAlign w:val="center"/>
+          </w:tcPr>
+          <w:p>
+            <w:pPr>
+              <w:pStyle w:val="Compact"/>
+              <w:keepNext/>
+              <w:jc w:val="center"/>
+            </w:pPr>
+            <w:r>
+              <w:rPr>
+                <w:sz w:val="20"/>
+              </w:rPr>
+              <w:t xml:space="preserve"> </w:t>
+            </w:r>
+          </w:p>
+        </w:tc>
+        <w:tc>
+          <w:tcPr>
+            <w:vAlign w:val="center"/>
+          </w:tcPr>
+          <w:p>
+            <w:pPr>
+              <w:pStyle w:val="Compact"/>
+              <w:keepNext/>
+              <w:jc w:val="center"/>
+            </w:pPr>
+            <w:r>
+              <w:rPr>
+                <w:sz w:val="20"/>
+              </w:rPr>
+              <w:t xml:space="preserve"> </w:t>
+            </w:r>
+          </w:p>
+        </w:tc>
+        <w:tc>
+          <w:tcPr>
+            <w:vAlign w:val="center"/>
+          </w:tcPr>
+          <w:p>
+            <w:pPr>
+              <w:pStyle w:val="Compact"/>
+              <w:keepNext/>
+              <w:jc w:val="center"/>
+            </w:pPr>
+            <w:r>
+              <w:rPr>
+                <w:sz w:val="20"/>
+              </w:rPr>
+              <w:t xml:space="preserve"> </w:t>
+            </w:r>
+          </w:p>
+        </w:tc>
+        <w:tc>
+          <w:tcPr>
+            <w:vAlign w:val="center"/>
+          </w:tcPr>
+          <w:p>
+            <w:pPr>
+              <w:pStyle w:val="Compact"/>
+              <w:keepNext/>
               <w:jc w:val="center"/>
             </w:pPr>
             <w:r>
@@ -1493,125 +1463,133 @@
           <w:p>
             <w:pPr>
               <w:pStyle w:val="Compact"/>
-              <w:jc w:val="center"/>
-            </w:pPr>
-            <w:r>
-              <w:rPr>
-                <w:sz w:val="20"/>
-              </w:rPr>
-              <w:t xml:space="preserve"> </w:t>
-            </w:r>
-          </w:p>
-        </w:tc>
-        <w:tc>
-          <w:tcPr>
-            <w:vAlign w:val="center"/>
-          </w:tcPr>
-          <w:p>
-            <w:pPr>
-              <w:pStyle w:val="Compact"/>
-              <w:jc w:val="center"/>
-            </w:pPr>
-            <w:r>
-              <w:rPr>
-                <w:sz w:val="20"/>
-              </w:rPr>
-              <w:t xml:space="preserve"> </w:t>
-            </w:r>
-          </w:p>
-        </w:tc>
-        <w:tc>
-          <w:tcPr>
-            <w:vAlign w:val="center"/>
-          </w:tcPr>
-          <w:p>
-            <w:pPr>
-              <w:pStyle w:val="Compact"/>
-              <w:jc w:val="center"/>
-            </w:pPr>
-            <w:r>
-              <w:rPr>
-                <w:sz w:val="20"/>
-              </w:rPr>
-              <w:t xml:space="preserve"> </w:t>
-            </w:r>
-          </w:p>
-        </w:tc>
-        <w:tc>
-          <w:tcPr>
-            <w:vAlign w:val="center"/>
-          </w:tcPr>
-          <w:p>
-            <w:pPr>
-              <w:pStyle w:val="Compact"/>
-              <w:jc w:val="center"/>
-            </w:pPr>
-            <w:r>
-              <w:rPr>
-                <w:sz w:val="20"/>
-              </w:rPr>
-              <w:t xml:space="preserve"> </w:t>
-            </w:r>
-          </w:p>
-        </w:tc>
-        <w:tc>
-          <w:tcPr>
-            <w:vAlign w:val="center"/>
-          </w:tcPr>
-          <w:p>
-            <w:pPr>
-              <w:pStyle w:val="Compact"/>
-              <w:jc w:val="center"/>
-            </w:pPr>
-            <w:r>
-              <w:rPr>
-                <w:sz w:val="20"/>
-              </w:rPr>
-              <w:t xml:space="preserve"> </w:t>
-            </w:r>
-          </w:p>
-        </w:tc>
-        <w:tc>
-          <w:tcPr>
-            <w:vAlign w:val="center"/>
-          </w:tcPr>
-          <w:p>
-            <w:pPr>
-              <w:pStyle w:val="Compact"/>
-              <w:jc w:val="center"/>
-            </w:pPr>
-            <w:r>
-              <w:rPr>
-                <w:sz w:val="20"/>
-              </w:rPr>
-              <w:t xml:space="preserve"> </w:t>
-            </w:r>
-          </w:p>
-        </w:tc>
-        <w:tc>
-          <w:tcPr>
-            <w:vAlign w:val="center"/>
-          </w:tcPr>
-          <w:p>
-            <w:pPr>
-              <w:pStyle w:val="Compact"/>
-              <w:jc w:val="center"/>
-            </w:pPr>
-            <w:r>
-              <w:rPr>
-                <w:sz w:val="20"/>
-              </w:rPr>
-              <w:t xml:space="preserve"> </w:t>
-            </w:r>
-          </w:p>
-        </w:tc>
-        <w:tc>
-          <w:tcPr>
-            <w:vAlign w:val="center"/>
-          </w:tcPr>
-          <w:p>
-            <w:pPr>
-              <w:pStyle w:val="Compact"/>
+              <w:keepNext/>
+              <w:jc w:val="center"/>
+            </w:pPr>
+            <w:r>
+              <w:rPr>
+                <w:sz w:val="20"/>
+              </w:rPr>
+              <w:t xml:space="preserve"> </w:t>
+            </w:r>
+          </w:p>
+        </w:tc>
+        <w:tc>
+          <w:tcPr>
+            <w:vAlign w:val="center"/>
+          </w:tcPr>
+          <w:p>
+            <w:pPr>
+              <w:pStyle w:val="Compact"/>
+              <w:keepNext/>
+              <w:jc w:val="center"/>
+            </w:pPr>
+            <w:r>
+              <w:rPr>
+                <w:sz w:val="20"/>
+              </w:rPr>
+              <w:t xml:space="preserve"> </w:t>
+            </w:r>
+          </w:p>
+        </w:tc>
+        <w:tc>
+          <w:tcPr>
+            <w:vAlign w:val="center"/>
+          </w:tcPr>
+          <w:p>
+            <w:pPr>
+              <w:pStyle w:val="Compact"/>
+              <w:keepNext/>
+              <w:jc w:val="center"/>
+            </w:pPr>
+            <w:r>
+              <w:rPr>
+                <w:sz w:val="20"/>
+              </w:rPr>
+              <w:t xml:space="preserve"> </w:t>
+            </w:r>
+          </w:p>
+        </w:tc>
+        <w:tc>
+          <w:tcPr>
+            <w:vAlign w:val="center"/>
+          </w:tcPr>
+          <w:p>
+            <w:pPr>
+              <w:pStyle w:val="Compact"/>
+              <w:keepNext/>
+              <w:jc w:val="center"/>
+            </w:pPr>
+            <w:r>
+              <w:rPr>
+                <w:sz w:val="20"/>
+              </w:rPr>
+              <w:t xml:space="preserve"> </w:t>
+            </w:r>
+          </w:p>
+        </w:tc>
+        <w:tc>
+          <w:tcPr>
+            <w:vAlign w:val="center"/>
+          </w:tcPr>
+          <w:p>
+            <w:pPr>
+              <w:pStyle w:val="Compact"/>
+              <w:keepNext/>
+              <w:jc w:val="center"/>
+            </w:pPr>
+            <w:r>
+              <w:rPr>
+                <w:sz w:val="20"/>
+              </w:rPr>
+              <w:t xml:space="preserve"> </w:t>
+            </w:r>
+          </w:p>
+        </w:tc>
+        <w:tc>
+          <w:tcPr>
+            <w:vAlign w:val="center"/>
+          </w:tcPr>
+          <w:p>
+            <w:pPr>
+              <w:pStyle w:val="Compact"/>
+              <w:keepNext/>
+              <w:jc w:val="center"/>
+            </w:pPr>
+            <w:r>
+              <w:rPr>
+                <w:sz w:val="20"/>
+              </w:rPr>
+              <w:t xml:space="preserve"> </w:t>
+            </w:r>
+          </w:p>
+        </w:tc>
+        <w:tc>
+          <w:tcPr>
+            <w:vAlign w:val="center"/>
+          </w:tcPr>
+          <w:p>
+            <w:pPr>
+              <w:pStyle w:val="Compact"/>
+              <w:keepNext/>
+              <w:jc w:val="center"/>
+            </w:pPr>
+            <w:r>
+              <w:rPr>
+                <w:sz w:val="20"/>
+              </w:rPr>
+              <w:t xml:space="preserve"> </w:t>
+            </w:r>
+          </w:p>
+        </w:tc>
+        <w:tc>
+          <w:tcPr>
+            <w:vAlign w:val="center"/>
+          </w:tcPr>
+          <w:p>
+            <w:pPr>
+              <w:pStyle w:val="Compact"/>
+              <w:keepNext/>
               <w:jc w:val="center"/>
             </w:pPr>
             <w:r>
@@ -1634,125 +1612,133 @@
           <w:p>
             <w:pPr>
               <w:pStyle w:val="Compact"/>
-              <w:jc w:val="center"/>
-            </w:pPr>
-            <w:r>
-              <w:rPr>
-                <w:sz w:val="20"/>
-              </w:rPr>
-              <w:t xml:space="preserve"> </w:t>
-            </w:r>
-          </w:p>
-        </w:tc>
-        <w:tc>
-          <w:tcPr>
-            <w:vAlign w:val="center"/>
-          </w:tcPr>
-          <w:p>
-            <w:pPr>
-              <w:pStyle w:val="Compact"/>
-              <w:jc w:val="center"/>
-            </w:pPr>
-            <w:r>
-              <w:rPr>
-                <w:sz w:val="20"/>
-              </w:rPr>
-              <w:t xml:space="preserve"> </w:t>
-            </w:r>
-          </w:p>
-        </w:tc>
-        <w:tc>
-          <w:tcPr>
-            <w:vAlign w:val="center"/>
-          </w:tcPr>
-          <w:p>
-            <w:pPr>
-              <w:pStyle w:val="Compact"/>
-              <w:jc w:val="center"/>
-            </w:pPr>
-            <w:r>
-              <w:rPr>
-                <w:sz w:val="20"/>
-              </w:rPr>
-              <w:t xml:space="preserve"> </w:t>
-            </w:r>
-          </w:p>
-        </w:tc>
-        <w:tc>
-          <w:tcPr>
-            <w:vAlign w:val="center"/>
-          </w:tcPr>
-          <w:p>
-            <w:pPr>
-              <w:pStyle w:val="Compact"/>
-              <w:jc w:val="center"/>
-            </w:pPr>
-            <w:r>
-              <w:rPr>
-                <w:sz w:val="20"/>
-              </w:rPr>
-              <w:t xml:space="preserve"> </w:t>
-            </w:r>
-          </w:p>
-        </w:tc>
-        <w:tc>
-          <w:tcPr>
-            <w:vAlign w:val="center"/>
-          </w:tcPr>
-          <w:p>
-            <w:pPr>
-              <w:pStyle w:val="Compact"/>
-              <w:jc w:val="center"/>
-            </w:pPr>
-            <w:r>
-              <w:rPr>
-                <w:sz w:val="20"/>
-              </w:rPr>
-              <w:t xml:space="preserve"> </w:t>
-            </w:r>
-          </w:p>
-        </w:tc>
-        <w:tc>
-          <w:tcPr>
-            <w:vAlign w:val="center"/>
-          </w:tcPr>
-          <w:p>
-            <w:pPr>
-              <w:pStyle w:val="Compact"/>
-              <w:jc w:val="center"/>
-            </w:pPr>
-            <w:r>
-              <w:rPr>
-                <w:sz w:val="20"/>
-              </w:rPr>
-              <w:t xml:space="preserve"> </w:t>
-            </w:r>
-          </w:p>
-        </w:tc>
-        <w:tc>
-          <w:tcPr>
-            <w:vAlign w:val="center"/>
-          </w:tcPr>
-          <w:p>
-            <w:pPr>
-              <w:pStyle w:val="Compact"/>
-              <w:jc w:val="center"/>
-            </w:pPr>
-            <w:r>
-              <w:rPr>
-                <w:sz w:val="20"/>
-              </w:rPr>
-              <w:t xml:space="preserve"> </w:t>
-            </w:r>
-          </w:p>
-        </w:tc>
-        <w:tc>
-          <w:tcPr>
-            <w:vAlign w:val="center"/>
-          </w:tcPr>
-          <w:p>
-            <w:pPr>
-              <w:pStyle w:val="Compact"/>
+              <w:keepNext/>
+              <w:jc w:val="center"/>
+            </w:pPr>
+            <w:r>
+              <w:rPr>
+                <w:sz w:val="20"/>
+              </w:rPr>
+              <w:t xml:space="preserve"> </w:t>
+            </w:r>
+          </w:p>
+        </w:tc>
+        <w:tc>
+          <w:tcPr>
+            <w:vAlign w:val="center"/>
+          </w:tcPr>
+          <w:p>
+            <w:pPr>
+              <w:pStyle w:val="Compact"/>
+              <w:keepNext/>
+              <w:jc w:val="center"/>
+            </w:pPr>
+            <w:r>
+              <w:rPr>
+                <w:sz w:val="20"/>
+              </w:rPr>
+              <w:t xml:space="preserve"> </w:t>
+            </w:r>
+          </w:p>
+        </w:tc>
+        <w:tc>
+          <w:tcPr>
+            <w:vAlign w:val="center"/>
+          </w:tcPr>
+          <w:p>
+            <w:pPr>
+              <w:pStyle w:val="Compact"/>
+              <w:keepNext/>
+              <w:jc w:val="center"/>
+            </w:pPr>
+            <w:r>
+              <w:rPr>
+                <w:sz w:val="20"/>
+              </w:rPr>
+              <w:t xml:space="preserve"> </w:t>
+            </w:r>
+          </w:p>
+        </w:tc>
+        <w:tc>
+          <w:tcPr>
+            <w:vAlign w:val="center"/>
+          </w:tcPr>
+          <w:p>
+            <w:pPr>
+              <w:pStyle w:val="Compact"/>
+              <w:keepNext/>
+              <w:jc w:val="center"/>
+            </w:pPr>
+            <w:r>
+              <w:rPr>
+                <w:sz w:val="20"/>
+              </w:rPr>
+              <w:t xml:space="preserve"> </w:t>
+            </w:r>
+          </w:p>
+        </w:tc>
+        <w:tc>
+          <w:tcPr>
+            <w:vAlign w:val="center"/>
+          </w:tcPr>
+          <w:p>
+            <w:pPr>
+              <w:pStyle w:val="Compact"/>
+              <w:keepNext/>
+              <w:jc w:val="center"/>
+            </w:pPr>
+            <w:r>
+              <w:rPr>
+                <w:sz w:val="20"/>
+              </w:rPr>
+              <w:t xml:space="preserve"> </w:t>
+            </w:r>
+          </w:p>
+        </w:tc>
+        <w:tc>
+          <w:tcPr>
+            <w:vAlign w:val="center"/>
+          </w:tcPr>
+          <w:p>
+            <w:pPr>
+              <w:pStyle w:val="Compact"/>
+              <w:keepNext/>
+              <w:jc w:val="center"/>
+            </w:pPr>
+            <w:r>
+              <w:rPr>
+                <w:sz w:val="20"/>
+              </w:rPr>
+              <w:t xml:space="preserve"> </w:t>
+            </w:r>
+          </w:p>
+        </w:tc>
+        <w:tc>
+          <w:tcPr>
+            <w:vAlign w:val="center"/>
+          </w:tcPr>
+          <w:p>
+            <w:pPr>
+              <w:pStyle w:val="Compact"/>
+              <w:keepNext/>
+              <w:jc w:val="center"/>
+            </w:pPr>
+            <w:r>
+              <w:rPr>
+                <w:sz w:val="20"/>
+              </w:rPr>
+              <w:t xml:space="preserve"> </w:t>
+            </w:r>
+          </w:p>
+        </w:tc>
+        <w:tc>
+          <w:tcPr>
+            <w:vAlign w:val="center"/>
+          </w:tcPr>
+          <w:p>
+            <w:pPr>
+              <w:pStyle w:val="Compact"/>
+              <w:keepNext/>
               <w:jc w:val="center"/>
             </w:pPr>
             <w:r>
@@ -1775,125 +1761,133 @@
           <w:p>
             <w:pPr>
               <w:pStyle w:val="Compact"/>
-              <w:jc w:val="center"/>
-            </w:pPr>
-            <w:r>
-              <w:rPr>
-                <w:sz w:val="20"/>
-              </w:rPr>
-              <w:t xml:space="preserve"> </w:t>
-            </w:r>
-          </w:p>
-        </w:tc>
-        <w:tc>
-          <w:tcPr>
-            <w:vAlign w:val="center"/>
-          </w:tcPr>
-          <w:p>
-            <w:pPr>
-              <w:pStyle w:val="Compact"/>
-              <w:jc w:val="center"/>
-            </w:pPr>
-            <w:r>
-              <w:rPr>
-                <w:sz w:val="20"/>
-              </w:rPr>
-              <w:t xml:space="preserve"> </w:t>
-            </w:r>
-          </w:p>
-        </w:tc>
-        <w:tc>
-          <w:tcPr>
-            <w:vAlign w:val="center"/>
-          </w:tcPr>
-          <w:p>
-            <w:pPr>
-              <w:pStyle w:val="Compact"/>
-              <w:jc w:val="center"/>
-            </w:pPr>
-            <w:r>
-              <w:rPr>
-                <w:sz w:val="20"/>
-              </w:rPr>
-              <w:t xml:space="preserve"> </w:t>
-            </w:r>
-          </w:p>
-        </w:tc>
-        <w:tc>
-          <w:tcPr>
-            <w:vAlign w:val="center"/>
-          </w:tcPr>
-          <w:p>
-            <w:pPr>
-              <w:pStyle w:val="Compact"/>
-              <w:jc w:val="center"/>
-            </w:pPr>
-            <w:r>
-              <w:rPr>
-                <w:sz w:val="20"/>
-              </w:rPr>
-              <w:t xml:space="preserve"> </w:t>
-            </w:r>
-          </w:p>
-        </w:tc>
-        <w:tc>
-          <w:tcPr>
-            <w:vAlign w:val="center"/>
-          </w:tcPr>
-          <w:p>
-            <w:pPr>
-              <w:pStyle w:val="Compact"/>
-              <w:jc w:val="center"/>
-            </w:pPr>
-            <w:r>
-              <w:rPr>
-                <w:sz w:val="20"/>
-              </w:rPr>
-              <w:t xml:space="preserve"> </w:t>
-            </w:r>
-          </w:p>
-        </w:tc>
-        <w:tc>
-          <w:tcPr>
-            <w:vAlign w:val="center"/>
-          </w:tcPr>
-          <w:p>
-            <w:pPr>
-              <w:pStyle w:val="Compact"/>
-              <w:jc w:val="center"/>
-            </w:pPr>
-            <w:r>
-              <w:rPr>
-                <w:sz w:val="20"/>
-              </w:rPr>
-              <w:t xml:space="preserve"> </w:t>
-            </w:r>
-          </w:p>
-        </w:tc>
-        <w:tc>
-          <w:tcPr>
-            <w:vAlign w:val="center"/>
-          </w:tcPr>
-          <w:p>
-            <w:pPr>
-              <w:pStyle w:val="Compact"/>
-              <w:jc w:val="center"/>
-            </w:pPr>
-            <w:r>
-              <w:rPr>
-                <w:sz w:val="20"/>
-              </w:rPr>
-              <w:t xml:space="preserve"> </w:t>
-            </w:r>
-          </w:p>
-        </w:tc>
-        <w:tc>
-          <w:tcPr>
-            <w:vAlign w:val="center"/>
-          </w:tcPr>
-          <w:p>
-            <w:pPr>
-              <w:pStyle w:val="Compact"/>
+              <w:keepNext/>
+              <w:jc w:val="center"/>
+            </w:pPr>
+            <w:r>
+              <w:rPr>
+                <w:sz w:val="20"/>
+              </w:rPr>
+              <w:t xml:space="preserve"> </w:t>
+            </w:r>
+          </w:p>
+        </w:tc>
+        <w:tc>
+          <w:tcPr>
+            <w:vAlign w:val="center"/>
+          </w:tcPr>
+          <w:p>
+            <w:pPr>
+              <w:pStyle w:val="Compact"/>
+              <w:keepNext/>
+              <w:jc w:val="center"/>
+            </w:pPr>
+            <w:r>
+              <w:rPr>
+                <w:sz w:val="20"/>
+              </w:rPr>
+              <w:t xml:space="preserve"> </w:t>
+            </w:r>
+          </w:p>
+        </w:tc>
+        <w:tc>
+          <w:tcPr>
+            <w:vAlign w:val="center"/>
+          </w:tcPr>
+          <w:p>
+            <w:pPr>
+              <w:pStyle w:val="Compact"/>
+              <w:keepNext/>
+              <w:jc w:val="center"/>
+            </w:pPr>
+            <w:r>
+              <w:rPr>
+                <w:sz w:val="20"/>
+              </w:rPr>
+              <w:t xml:space="preserve"> </w:t>
+            </w:r>
+          </w:p>
+        </w:tc>
+        <w:tc>
+          <w:tcPr>
+            <w:vAlign w:val="center"/>
+          </w:tcPr>
+          <w:p>
+            <w:pPr>
+              <w:pStyle w:val="Compact"/>
+              <w:keepNext/>
+              <w:jc w:val="center"/>
+            </w:pPr>
+            <w:r>
+              <w:rPr>
+                <w:sz w:val="20"/>
+              </w:rPr>
+              <w:t xml:space="preserve"> </w:t>
+            </w:r>
+          </w:p>
+        </w:tc>
+        <w:tc>
+          <w:tcPr>
+            <w:vAlign w:val="center"/>
+          </w:tcPr>
+          <w:p>
+            <w:pPr>
+              <w:pStyle w:val="Compact"/>
+              <w:keepNext/>
+              <w:jc w:val="center"/>
+            </w:pPr>
+            <w:r>
+              <w:rPr>
+                <w:sz w:val="20"/>
+              </w:rPr>
+              <w:t xml:space="preserve"> </w:t>
+            </w:r>
+          </w:p>
+        </w:tc>
+        <w:tc>
+          <w:tcPr>
+            <w:vAlign w:val="center"/>
+          </w:tcPr>
+          <w:p>
+            <w:pPr>
+              <w:pStyle w:val="Compact"/>
+              <w:keepNext/>
+              <w:jc w:val="center"/>
+            </w:pPr>
+            <w:r>
+              <w:rPr>
+                <w:sz w:val="20"/>
+              </w:rPr>
+              <w:t xml:space="preserve"> </w:t>
+            </w:r>
+          </w:p>
+        </w:tc>
+        <w:tc>
+          <w:tcPr>
+            <w:vAlign w:val="center"/>
+          </w:tcPr>
+          <w:p>
+            <w:pPr>
+              <w:pStyle w:val="Compact"/>
+              <w:keepNext/>
+              <w:jc w:val="center"/>
+            </w:pPr>
+            <w:r>
+              <w:rPr>
+                <w:sz w:val="20"/>
+              </w:rPr>
+              <w:t xml:space="preserve"> </w:t>
+            </w:r>
+          </w:p>
+        </w:tc>
+        <w:tc>
+          <w:tcPr>
+            <w:vAlign w:val="center"/>
+          </w:tcPr>
+          <w:p>
+            <w:pPr>
+              <w:pStyle w:val="Compact"/>
+              <w:keepNext/>
               <w:jc w:val="center"/>
             </w:pPr>
             <w:r>
@@ -1916,125 +1910,133 @@
           <w:p>
             <w:pPr>
               <w:pStyle w:val="Compact"/>
-              <w:jc w:val="center"/>
-            </w:pPr>
-            <w:r>
-              <w:rPr>
-                <w:sz w:val="20"/>
-              </w:rPr>
-              <w:t xml:space="preserve"> </w:t>
-            </w:r>
-          </w:p>
-        </w:tc>
-        <w:tc>
-          <w:tcPr>
-            <w:vAlign w:val="center"/>
-          </w:tcPr>
-          <w:p>
-            <w:pPr>
-              <w:pStyle w:val="Compact"/>
-              <w:jc w:val="center"/>
-            </w:pPr>
-            <w:r>
-              <w:rPr>
-                <w:sz w:val="20"/>
-              </w:rPr>
-              <w:t xml:space="preserve"> </w:t>
-            </w:r>
-          </w:p>
-        </w:tc>
-        <w:tc>
-          <w:tcPr>
-            <w:vAlign w:val="center"/>
-          </w:tcPr>
-          <w:p>
-            <w:pPr>
-              <w:pStyle w:val="Compact"/>
-              <w:jc w:val="center"/>
-            </w:pPr>
-            <w:r>
-              <w:rPr>
-                <w:sz w:val="20"/>
-              </w:rPr>
-              <w:t xml:space="preserve"> </w:t>
-            </w:r>
-          </w:p>
-        </w:tc>
-        <w:tc>
-          <w:tcPr>
-            <w:vAlign w:val="center"/>
-          </w:tcPr>
-          <w:p>
-            <w:pPr>
-              <w:pStyle w:val="Compact"/>
-              <w:jc w:val="center"/>
-            </w:pPr>
-            <w:r>
-              <w:rPr>
-                <w:sz w:val="20"/>
-              </w:rPr>
-              <w:t xml:space="preserve"> </w:t>
-            </w:r>
-          </w:p>
-        </w:tc>
-        <w:tc>
-          <w:tcPr>
-            <w:vAlign w:val="center"/>
-          </w:tcPr>
-          <w:p>
-            <w:pPr>
-              <w:pStyle w:val="Compact"/>
-              <w:jc w:val="center"/>
-            </w:pPr>
-            <w:r>
-              <w:rPr>
-                <w:sz w:val="20"/>
-              </w:rPr>
-              <w:t xml:space="preserve"> </w:t>
-            </w:r>
-          </w:p>
-        </w:tc>
-        <w:tc>
-          <w:tcPr>
-            <w:vAlign w:val="center"/>
-          </w:tcPr>
-          <w:p>
-            <w:pPr>
-              <w:pStyle w:val="Compact"/>
-              <w:jc w:val="center"/>
-            </w:pPr>
-            <w:r>
-              <w:rPr>
-                <w:sz w:val="20"/>
-              </w:rPr>
-              <w:t xml:space="preserve"> </w:t>
-            </w:r>
-          </w:p>
-        </w:tc>
-        <w:tc>
-          <w:tcPr>
-            <w:vAlign w:val="center"/>
-          </w:tcPr>
-          <w:p>
-            <w:pPr>
-              <w:pStyle w:val="Compact"/>
-              <w:jc w:val="center"/>
-            </w:pPr>
-            <w:r>
-              <w:rPr>
-                <w:sz w:val="20"/>
-              </w:rPr>
-              <w:t xml:space="preserve"> </w:t>
-            </w:r>
-          </w:p>
-        </w:tc>
-        <w:tc>
-          <w:tcPr>
-            <w:vAlign w:val="center"/>
-          </w:tcPr>
-          <w:p>
-            <w:pPr>
-              <w:pStyle w:val="Compact"/>
+              <w:keepNext/>
+              <w:jc w:val="center"/>
+            </w:pPr>
+            <w:r>
+              <w:rPr>
+                <w:sz w:val="20"/>
+              </w:rPr>
+              <w:t xml:space="preserve"> </w:t>
+            </w:r>
+          </w:p>
+        </w:tc>
+        <w:tc>
+          <w:tcPr>
+            <w:vAlign w:val="center"/>
+          </w:tcPr>
+          <w:p>
+            <w:pPr>
+              <w:pStyle w:val="Compact"/>
+              <w:keepNext/>
+              <w:jc w:val="center"/>
+            </w:pPr>
+            <w:r>
+              <w:rPr>
+                <w:sz w:val="20"/>
+              </w:rPr>
+              <w:t xml:space="preserve"> </w:t>
+            </w:r>
+          </w:p>
+        </w:tc>
+        <w:tc>
+          <w:tcPr>
+            <w:vAlign w:val="center"/>
+          </w:tcPr>
+          <w:p>
+            <w:pPr>
+              <w:pStyle w:val="Compact"/>
+              <w:keepNext/>
+              <w:jc w:val="center"/>
+            </w:pPr>
+            <w:r>
+              <w:rPr>
+                <w:sz w:val="20"/>
+              </w:rPr>
+              <w:t xml:space="preserve"> </w:t>
+            </w:r>
+          </w:p>
+        </w:tc>
+        <w:tc>
+          <w:tcPr>
+            <w:vAlign w:val="center"/>
+          </w:tcPr>
+          <w:p>
+            <w:pPr>
+              <w:pStyle w:val="Compact"/>
+              <w:keepNext/>
+              <w:jc w:val="center"/>
+            </w:pPr>
+            <w:r>
+              <w:rPr>
+                <w:sz w:val="20"/>
+              </w:rPr>
+              <w:t xml:space="preserve"> </w:t>
+            </w:r>
+          </w:p>
+        </w:tc>
+        <w:tc>
+          <w:tcPr>
+            <w:vAlign w:val="center"/>
+          </w:tcPr>
+          <w:p>
+            <w:pPr>
+              <w:pStyle w:val="Compact"/>
+              <w:keepNext/>
+              <w:jc w:val="center"/>
+            </w:pPr>
+            <w:r>
+              <w:rPr>
+                <w:sz w:val="20"/>
+              </w:rPr>
+              <w:t xml:space="preserve"> </w:t>
+            </w:r>
+          </w:p>
+        </w:tc>
+        <w:tc>
+          <w:tcPr>
+            <w:vAlign w:val="center"/>
+          </w:tcPr>
+          <w:p>
+            <w:pPr>
+              <w:pStyle w:val="Compact"/>
+              <w:keepNext/>
+              <w:jc w:val="center"/>
+            </w:pPr>
+            <w:r>
+              <w:rPr>
+                <w:sz w:val="20"/>
+              </w:rPr>
+              <w:t xml:space="preserve"> </w:t>
+            </w:r>
+          </w:p>
+        </w:tc>
+        <w:tc>
+          <w:tcPr>
+            <w:vAlign w:val="center"/>
+          </w:tcPr>
+          <w:p>
+            <w:pPr>
+              <w:pStyle w:val="Compact"/>
+              <w:keepNext/>
+              <w:jc w:val="center"/>
+            </w:pPr>
+            <w:r>
+              <w:rPr>
+                <w:sz w:val="20"/>
+              </w:rPr>
+              <w:t xml:space="preserve"> </w:t>
+            </w:r>
+          </w:p>
+        </w:tc>
+        <w:tc>
+          <w:tcPr>
+            <w:vAlign w:val="center"/>
+          </w:tcPr>
+          <w:p>
+            <w:pPr>
+              <w:pStyle w:val="Compact"/>
+              <w:keepNext/>
               <w:jc w:val="center"/>
             </w:pPr>
             <w:r>
@@ -2057,125 +2059,133 @@
           <w:p>
             <w:pPr>
               <w:pStyle w:val="Compact"/>
-              <w:jc w:val="center"/>
-            </w:pPr>
-            <w:r>
-              <w:rPr>
-                <w:sz w:val="20"/>
-              </w:rPr>
-              <w:t xml:space="preserve"> </w:t>
-            </w:r>
-          </w:p>
-        </w:tc>
-        <w:tc>
-          <w:tcPr>
-            <w:vAlign w:val="center"/>
-          </w:tcPr>
-          <w:p>
-            <w:pPr>
-              <w:pStyle w:val="Compact"/>
-              <w:jc w:val="center"/>
-            </w:pPr>
-            <w:r>
-              <w:rPr>
-                <w:sz w:val="20"/>
-              </w:rPr>
-              <w:t xml:space="preserve"> </w:t>
-            </w:r>
-          </w:p>
-        </w:tc>
-        <w:tc>
-          <w:tcPr>
-            <w:vAlign w:val="center"/>
-          </w:tcPr>
-          <w:p>
-            <w:pPr>
-              <w:pStyle w:val="Compact"/>
-              <w:jc w:val="center"/>
-            </w:pPr>
-            <w:r>
-              <w:rPr>
-                <w:sz w:val="20"/>
-              </w:rPr>
-              <w:t xml:space="preserve"> </w:t>
-            </w:r>
-          </w:p>
-        </w:tc>
-        <w:tc>
-          <w:tcPr>
-            <w:vAlign w:val="center"/>
-          </w:tcPr>
-          <w:p>
-            <w:pPr>
-              <w:pStyle w:val="Compact"/>
-              <w:jc w:val="center"/>
-            </w:pPr>
-            <w:r>
-              <w:rPr>
-                <w:sz w:val="20"/>
-              </w:rPr>
-              <w:t xml:space="preserve"> </w:t>
-            </w:r>
-          </w:p>
-        </w:tc>
-        <w:tc>
-          <w:tcPr>
-            <w:vAlign w:val="center"/>
-          </w:tcPr>
-          <w:p>
-            <w:pPr>
-              <w:pStyle w:val="Compact"/>
-              <w:jc w:val="center"/>
-            </w:pPr>
-            <w:r>
-              <w:rPr>
-                <w:sz w:val="20"/>
-              </w:rPr>
-              <w:t xml:space="preserve"> </w:t>
-            </w:r>
-          </w:p>
-        </w:tc>
-        <w:tc>
-          <w:tcPr>
-            <w:vAlign w:val="center"/>
-          </w:tcPr>
-          <w:p>
-            <w:pPr>
-              <w:pStyle w:val="Compact"/>
-              <w:jc w:val="center"/>
-            </w:pPr>
-            <w:r>
-              <w:rPr>
-                <w:sz w:val="20"/>
-              </w:rPr>
-              <w:t xml:space="preserve"> </w:t>
-            </w:r>
-          </w:p>
-        </w:tc>
-        <w:tc>
-          <w:tcPr>
-            <w:vAlign w:val="center"/>
-          </w:tcPr>
-          <w:p>
-            <w:pPr>
-              <w:pStyle w:val="Compact"/>
-              <w:jc w:val="center"/>
-            </w:pPr>
-            <w:r>
-              <w:rPr>
-                <w:sz w:val="20"/>
-              </w:rPr>
-              <w:t xml:space="preserve"> </w:t>
-            </w:r>
-          </w:p>
-        </w:tc>
-        <w:tc>
-          <w:tcPr>
-            <w:vAlign w:val="center"/>
-          </w:tcPr>
-          <w:p>
-            <w:pPr>
-              <w:pStyle w:val="Compact"/>
+              <w:keepNext/>
+              <w:jc w:val="center"/>
+            </w:pPr>
+            <w:r>
+              <w:rPr>
+                <w:sz w:val="20"/>
+              </w:rPr>
+              <w:t xml:space="preserve"> </w:t>
+            </w:r>
+          </w:p>
+        </w:tc>
+        <w:tc>
+          <w:tcPr>
+            <w:vAlign w:val="center"/>
+          </w:tcPr>
+          <w:p>
+            <w:pPr>
+              <w:pStyle w:val="Compact"/>
+              <w:keepNext/>
+              <w:jc w:val="center"/>
+            </w:pPr>
+            <w:r>
+              <w:rPr>
+                <w:sz w:val="20"/>
+              </w:rPr>
+              <w:t xml:space="preserve"> </w:t>
+            </w:r>
+          </w:p>
+        </w:tc>
+        <w:tc>
+          <w:tcPr>
+            <w:vAlign w:val="center"/>
+          </w:tcPr>
+          <w:p>
+            <w:pPr>
+              <w:pStyle w:val="Compact"/>
+              <w:keepNext/>
+              <w:jc w:val="center"/>
+            </w:pPr>
+            <w:r>
+              <w:rPr>
+                <w:sz w:val="20"/>
+              </w:rPr>
+              <w:t xml:space="preserve"> </w:t>
+            </w:r>
+          </w:p>
+        </w:tc>
+        <w:tc>
+          <w:tcPr>
+            <w:vAlign w:val="center"/>
+          </w:tcPr>
+          <w:p>
+            <w:pPr>
+              <w:pStyle w:val="Compact"/>
+              <w:keepNext/>
+              <w:jc w:val="center"/>
+            </w:pPr>
+            <w:r>
+              <w:rPr>
+                <w:sz w:val="20"/>
+              </w:rPr>
+              <w:t xml:space="preserve"> </w:t>
+            </w:r>
+          </w:p>
+        </w:tc>
+        <w:tc>
+          <w:tcPr>
+            <w:vAlign w:val="center"/>
+          </w:tcPr>
+          <w:p>
+            <w:pPr>
+              <w:pStyle w:val="Compact"/>
+              <w:keepNext/>
+              <w:jc w:val="center"/>
+            </w:pPr>
+            <w:r>
+              <w:rPr>
+                <w:sz w:val="20"/>
+              </w:rPr>
+              <w:t xml:space="preserve"> </w:t>
+            </w:r>
+          </w:p>
+        </w:tc>
+        <w:tc>
+          <w:tcPr>
+            <w:vAlign w:val="center"/>
+          </w:tcPr>
+          <w:p>
+            <w:pPr>
+              <w:pStyle w:val="Compact"/>
+              <w:keepNext/>
+              <w:jc w:val="center"/>
+            </w:pPr>
+            <w:r>
+              <w:rPr>
+                <w:sz w:val="20"/>
+              </w:rPr>
+              <w:t xml:space="preserve"> </w:t>
+            </w:r>
+          </w:p>
+        </w:tc>
+        <w:tc>
+          <w:tcPr>
+            <w:vAlign w:val="center"/>
+          </w:tcPr>
+          <w:p>
+            <w:pPr>
+              <w:pStyle w:val="Compact"/>
+              <w:keepNext/>
+              <w:jc w:val="center"/>
+            </w:pPr>
+            <w:r>
+              <w:rPr>
+                <w:sz w:val="20"/>
+              </w:rPr>
+              <w:t xml:space="preserve"> </w:t>
+            </w:r>
+          </w:p>
+        </w:tc>
+        <w:tc>
+          <w:tcPr>
+            <w:vAlign w:val="center"/>
+          </w:tcPr>
+          <w:p>
+            <w:pPr>
+              <w:pStyle w:val="Compact"/>
+              <w:keepNext/>
               <w:jc w:val="center"/>
             </w:pPr>
             <w:r>
@@ -2198,125 +2208,133 @@
           <w:p>
             <w:pPr>
               <w:pStyle w:val="Compact"/>
-              <w:jc w:val="center"/>
-            </w:pPr>
-            <w:r>
-              <w:rPr>
-                <w:sz w:val="20"/>
-              </w:rPr>
-              <w:t xml:space="preserve"> </w:t>
-            </w:r>
-          </w:p>
-        </w:tc>
-        <w:tc>
-          <w:tcPr>
-            <w:vAlign w:val="center"/>
-          </w:tcPr>
-          <w:p>
-            <w:pPr>
-              <w:pStyle w:val="Compact"/>
-              <w:jc w:val="center"/>
-            </w:pPr>
-            <w:r>
-              <w:rPr>
-                <w:sz w:val="20"/>
-              </w:rPr>
-              <w:t xml:space="preserve"> </w:t>
-            </w:r>
-          </w:p>
-        </w:tc>
-        <w:tc>
-          <w:tcPr>
-            <w:vAlign w:val="center"/>
-          </w:tcPr>
-          <w:p>
-            <w:pPr>
-              <w:pStyle w:val="Compact"/>
-              <w:jc w:val="center"/>
-            </w:pPr>
-            <w:r>
-              <w:rPr>
-                <w:sz w:val="20"/>
-              </w:rPr>
-              <w:t xml:space="preserve"> </w:t>
-            </w:r>
-          </w:p>
-        </w:tc>
-        <w:tc>
-          <w:tcPr>
-            <w:vAlign w:val="center"/>
-          </w:tcPr>
-          <w:p>
-            <w:pPr>
-              <w:pStyle w:val="Compact"/>
-              <w:jc w:val="center"/>
-            </w:pPr>
-            <w:r>
-              <w:rPr>
-                <w:sz w:val="20"/>
-              </w:rPr>
-              <w:t xml:space="preserve"> </w:t>
-            </w:r>
-          </w:p>
-        </w:tc>
-        <w:tc>
-          <w:tcPr>
-            <w:vAlign w:val="center"/>
-          </w:tcPr>
-          <w:p>
-            <w:pPr>
-              <w:pStyle w:val="Compact"/>
-              <w:jc w:val="center"/>
-            </w:pPr>
-            <w:r>
-              <w:rPr>
-                <w:sz w:val="20"/>
-              </w:rPr>
-              <w:t xml:space="preserve"> </w:t>
-            </w:r>
-          </w:p>
-        </w:tc>
-        <w:tc>
-          <w:tcPr>
-            <w:vAlign w:val="center"/>
-          </w:tcPr>
-          <w:p>
-            <w:pPr>
-              <w:pStyle w:val="Compact"/>
-              <w:jc w:val="center"/>
-            </w:pPr>
-            <w:r>
-              <w:rPr>
-                <w:sz w:val="20"/>
-              </w:rPr>
-              <w:t xml:space="preserve"> </w:t>
-            </w:r>
-          </w:p>
-        </w:tc>
-        <w:tc>
-          <w:tcPr>
-            <w:vAlign w:val="center"/>
-          </w:tcPr>
-          <w:p>
-            <w:pPr>
-              <w:pStyle w:val="Compact"/>
-              <w:jc w:val="center"/>
-            </w:pPr>
-            <w:r>
-              <w:rPr>
-                <w:sz w:val="20"/>
-              </w:rPr>
-              <w:t xml:space="preserve"> </w:t>
-            </w:r>
-          </w:p>
-        </w:tc>
-        <w:tc>
-          <w:tcPr>
-            <w:vAlign w:val="center"/>
-          </w:tcPr>
-          <w:p>
-            <w:pPr>
-              <w:pStyle w:val="Compact"/>
+              <w:keepNext/>
+              <w:jc w:val="center"/>
+            </w:pPr>
+            <w:r>
+              <w:rPr>
+                <w:sz w:val="20"/>
+              </w:rPr>
+              <w:t xml:space="preserve"> </w:t>
+            </w:r>
+          </w:p>
+        </w:tc>
+        <w:tc>
+          <w:tcPr>
+            <w:vAlign w:val="center"/>
+          </w:tcPr>
+          <w:p>
+            <w:pPr>
+              <w:pStyle w:val="Compact"/>
+              <w:keepNext/>
+              <w:jc w:val="center"/>
+            </w:pPr>
+            <w:r>
+              <w:rPr>
+                <w:sz w:val="20"/>
+              </w:rPr>
+              <w:t xml:space="preserve"> </w:t>
+            </w:r>
+          </w:p>
+        </w:tc>
+        <w:tc>
+          <w:tcPr>
+            <w:vAlign w:val="center"/>
+          </w:tcPr>
+          <w:p>
+            <w:pPr>
+              <w:pStyle w:val="Compact"/>
+              <w:keepNext/>
+              <w:jc w:val="center"/>
+            </w:pPr>
+            <w:r>
+              <w:rPr>
+                <w:sz w:val="20"/>
+              </w:rPr>
+              <w:t xml:space="preserve"> </w:t>
+            </w:r>
+          </w:p>
+        </w:tc>
+        <w:tc>
+          <w:tcPr>
+            <w:vAlign w:val="center"/>
+          </w:tcPr>
+          <w:p>
+            <w:pPr>
+              <w:pStyle w:val="Compact"/>
+              <w:keepNext/>
+              <w:jc w:val="center"/>
+            </w:pPr>
+            <w:r>
+              <w:rPr>
+                <w:sz w:val="20"/>
+              </w:rPr>
+              <w:t xml:space="preserve"> </w:t>
+            </w:r>
+          </w:p>
+        </w:tc>
+        <w:tc>
+          <w:tcPr>
+            <w:vAlign w:val="center"/>
+          </w:tcPr>
+          <w:p>
+            <w:pPr>
+              <w:pStyle w:val="Compact"/>
+              <w:keepNext/>
+              <w:jc w:val="center"/>
+            </w:pPr>
+            <w:r>
+              <w:rPr>
+                <w:sz w:val="20"/>
+              </w:rPr>
+              <w:t xml:space="preserve"> </w:t>
+            </w:r>
+          </w:p>
+        </w:tc>
+        <w:tc>
+          <w:tcPr>
+            <w:vAlign w:val="center"/>
+          </w:tcPr>
+          <w:p>
+            <w:pPr>
+              <w:pStyle w:val="Compact"/>
+              <w:keepNext/>
+              <w:jc w:val="center"/>
+            </w:pPr>
+            <w:r>
+              <w:rPr>
+                <w:sz w:val="20"/>
+              </w:rPr>
+              <w:t xml:space="preserve"> </w:t>
+            </w:r>
+          </w:p>
+        </w:tc>
+        <w:tc>
+          <w:tcPr>
+            <w:vAlign w:val="center"/>
+          </w:tcPr>
+          <w:p>
+            <w:pPr>
+              <w:pStyle w:val="Compact"/>
+              <w:keepNext/>
+              <w:jc w:val="center"/>
+            </w:pPr>
+            <w:r>
+              <w:rPr>
+                <w:sz w:val="20"/>
+              </w:rPr>
+              <w:t xml:space="preserve"> </w:t>
+            </w:r>
+          </w:p>
+        </w:tc>
+        <w:tc>
+          <w:tcPr>
+            <w:vAlign w:val="center"/>
+          </w:tcPr>
+          <w:p>
+            <w:pPr>
+              <w:pStyle w:val="Compact"/>
+              <w:keepNext/>
               <w:jc w:val="center"/>
             </w:pPr>
             <w:r>
@@ -2595,6 +2613,7 @@
           <w:p>
             <w:pPr>
               <w:pStyle w:val="Compact"/>
+              <w:keepNext/>
               <w:jc w:val="center"/>
             </w:pPr>
             <m:oMath>
@@ -2624,6 +2643,7 @@
           <w:p>
             <w:pPr>
               <w:pStyle w:val="Compact"/>
+              <w:keepNext/>
               <w:jc w:val="center"/>
             </w:pPr>
             <m:oMath>
@@ -2662,6 +2682,7 @@
           <w:p>
             <w:pPr>
               <w:pStyle w:val="Compact"/>
+              <w:keepNext/>
               <w:jc w:val="center"/>
             </w:pPr>
             <m:oMath>
@@ -2691,6 +2712,7 @@
           <w:p>
             <w:pPr>
               <w:pStyle w:val="Compact"/>
+              <w:keepNext/>
               <w:jc w:val="center"/>
             </w:pPr>
             <m:oMath>
@@ -2738,6 +2760,7 @@
           <w:p>
             <w:pPr>
               <w:pStyle w:val="Compact"/>
+              <w:keepNext/>
               <w:jc w:val="center"/>
             </w:pPr>
             <m:oMath>
@@ -2791,74 +2814,79 @@
           <w:p>
             <w:pPr>
               <w:pStyle w:val="Compact"/>
-              <w:jc w:val="center"/>
-            </w:pPr>
-            <w:r>
-              <w:rPr>
-                <w:sz w:val="20"/>
-              </w:rPr>
-              <w:t xml:space="preserve"> </w:t>
-            </w:r>
-          </w:p>
-        </w:tc>
-        <w:tc>
-          <w:tcPr>
-            <w:vAlign w:val="center"/>
-          </w:tcPr>
-          <w:p>
-            <w:pPr>
-              <w:pStyle w:val="Compact"/>
-              <w:jc w:val="center"/>
-            </w:pPr>
-            <w:r>
-              <w:rPr>
-                <w:sz w:val="20"/>
-              </w:rPr>
-              <w:t xml:space="preserve"> </w:t>
-            </w:r>
-          </w:p>
-        </w:tc>
-        <w:tc>
-          <w:tcPr>
-            <w:vAlign w:val="center"/>
-          </w:tcPr>
-          <w:p>
-            <w:pPr>
-              <w:pStyle w:val="Compact"/>
-              <w:jc w:val="center"/>
-            </w:pPr>
-            <w:r>
-              <w:rPr>
-                <w:sz w:val="20"/>
-              </w:rPr>
-              <w:t xml:space="preserve"> </w:t>
-            </w:r>
-          </w:p>
-        </w:tc>
-        <w:tc>
-          <w:tcPr>
-            <w:vAlign w:val="center"/>
-          </w:tcPr>
-          <w:p>
-            <w:pPr>
-              <w:pStyle w:val="Compact"/>
-              <w:jc w:val="center"/>
-            </w:pPr>
-            <w:r>
-              <w:rPr>
-                <w:sz w:val="20"/>
-              </w:rPr>
-              <w:t xml:space="preserve"> </w:t>
-            </w:r>
-          </w:p>
-        </w:tc>
-        <w:tc>
-          <w:tcPr>
-            <w:vAlign w:val="center"/>
-          </w:tcPr>
-          <w:p>
-            <w:pPr>
-              <w:pStyle w:val="Compact"/>
+              <w:keepNext/>
+              <w:jc w:val="center"/>
+            </w:pPr>
+            <w:r>
+              <w:rPr>
+                <w:sz w:val="20"/>
+              </w:rPr>
+              <w:t xml:space="preserve"> </w:t>
+            </w:r>
+          </w:p>
+        </w:tc>
+        <w:tc>
+          <w:tcPr>
+            <w:vAlign w:val="center"/>
+          </w:tcPr>
+          <w:p>
+            <w:pPr>
+              <w:pStyle w:val="Compact"/>
+              <w:keepNext/>
+              <w:jc w:val="center"/>
+            </w:pPr>
+            <w:r>
+              <w:rPr>
+                <w:sz w:val="20"/>
+              </w:rPr>
+              <w:t xml:space="preserve"> </w:t>
+            </w:r>
+          </w:p>
+        </w:tc>
+        <w:tc>
+          <w:tcPr>
+            <w:vAlign w:val="center"/>
+          </w:tcPr>
+          <w:p>
+            <w:pPr>
+              <w:pStyle w:val="Compact"/>
+              <w:keepNext/>
+              <w:jc w:val="center"/>
+            </w:pPr>
+            <w:r>
+              <w:rPr>
+                <w:sz w:val="20"/>
+              </w:rPr>
+              <w:t xml:space="preserve"> </w:t>
+            </w:r>
+          </w:p>
+        </w:tc>
+        <w:tc>
+          <w:tcPr>
+            <w:vAlign w:val="center"/>
+          </w:tcPr>
+          <w:p>
+            <w:pPr>
+              <w:pStyle w:val="Compact"/>
+              <w:keepNext/>
+              <w:jc w:val="center"/>
+            </w:pPr>
+            <w:r>
+              <w:rPr>
+                <w:sz w:val="20"/>
+              </w:rPr>
+              <w:t xml:space="preserve"> </w:t>
+            </w:r>
+          </w:p>
+        </w:tc>
+        <w:tc>
+          <w:tcPr>
+            <w:vAlign w:val="center"/>
+          </w:tcPr>
+          <w:p>
+            <w:pPr>
+              <w:pStyle w:val="Compact"/>
+              <w:keepNext/>
               <w:jc w:val="center"/>
             </w:pPr>
             <w:r>
@@ -2881,74 +2909,79 @@
           <w:p>
             <w:pPr>
               <w:pStyle w:val="Compact"/>
-              <w:jc w:val="center"/>
-            </w:pPr>
-            <w:r>
-              <w:rPr>
-                <w:sz w:val="20"/>
-              </w:rPr>
-              <w:t xml:space="preserve"> </w:t>
-            </w:r>
-          </w:p>
-        </w:tc>
-        <w:tc>
-          <w:tcPr>
-            <w:vAlign w:val="center"/>
-          </w:tcPr>
-          <w:p>
-            <w:pPr>
-              <w:pStyle w:val="Compact"/>
-              <w:jc w:val="center"/>
-            </w:pPr>
-            <w:r>
-              <w:rPr>
-                <w:sz w:val="20"/>
-              </w:rPr>
-              <w:t xml:space="preserve"> </w:t>
-            </w:r>
-          </w:p>
-        </w:tc>
-        <w:tc>
-          <w:tcPr>
-            <w:vAlign w:val="center"/>
-          </w:tcPr>
-          <w:p>
-            <w:pPr>
-              <w:pStyle w:val="Compact"/>
-              <w:jc w:val="center"/>
-            </w:pPr>
-            <w:r>
-              <w:rPr>
-                <w:sz w:val="20"/>
-              </w:rPr>
-              <w:t xml:space="preserve"> </w:t>
-            </w:r>
-          </w:p>
-        </w:tc>
-        <w:tc>
-          <w:tcPr>
-            <w:vAlign w:val="center"/>
-          </w:tcPr>
-          <w:p>
-            <w:pPr>
-              <w:pStyle w:val="Compact"/>
-              <w:jc w:val="center"/>
-            </w:pPr>
-            <w:r>
-              <w:rPr>
-                <w:sz w:val="20"/>
-              </w:rPr>
-              <w:t xml:space="preserve"> </w:t>
-            </w:r>
-          </w:p>
-        </w:tc>
-        <w:tc>
-          <w:tcPr>
-            <w:vAlign w:val="center"/>
-          </w:tcPr>
-          <w:p>
-            <w:pPr>
-              <w:pStyle w:val="Compact"/>
+              <w:keepNext/>
+              <w:jc w:val="center"/>
+            </w:pPr>
+            <w:r>
+              <w:rPr>
+                <w:sz w:val="20"/>
+              </w:rPr>
+              <w:t xml:space="preserve"> </w:t>
+            </w:r>
+          </w:p>
+        </w:tc>
+        <w:tc>
+          <w:tcPr>
+            <w:vAlign w:val="center"/>
+          </w:tcPr>
+          <w:p>
+            <w:pPr>
+              <w:pStyle w:val="Compact"/>
+              <w:keepNext/>
+              <w:jc w:val="center"/>
+            </w:pPr>
+            <w:r>
+              <w:rPr>
+                <w:sz w:val="20"/>
+              </w:rPr>
+              <w:t xml:space="preserve"> </w:t>
+            </w:r>
+          </w:p>
+        </w:tc>
+        <w:tc>
+          <w:tcPr>
+            <w:vAlign w:val="center"/>
+          </w:tcPr>
+          <w:p>
+            <w:pPr>
+              <w:pStyle w:val="Compact"/>
+              <w:keepNext/>
+              <w:jc w:val="center"/>
+            </w:pPr>
+            <w:r>
+              <w:rPr>
+                <w:sz w:val="20"/>
+              </w:rPr>
+              <w:t xml:space="preserve"> </w:t>
+            </w:r>
+          </w:p>
+        </w:tc>
+        <w:tc>
+          <w:tcPr>
+            <w:vAlign w:val="center"/>
+          </w:tcPr>
+          <w:p>
+            <w:pPr>
+              <w:pStyle w:val="Compact"/>
+              <w:keepNext/>
+              <w:jc w:val="center"/>
+            </w:pPr>
+            <w:r>
+              <w:rPr>
+                <w:sz w:val="20"/>
+              </w:rPr>
+              <w:t xml:space="preserve"> </w:t>
+            </w:r>
+          </w:p>
+        </w:tc>
+        <w:tc>
+          <w:tcPr>
+            <w:vAlign w:val="center"/>
+          </w:tcPr>
+          <w:p>
+            <w:pPr>
+              <w:pStyle w:val="Compact"/>
+              <w:keepNext/>
               <w:jc w:val="center"/>
             </w:pPr>
             <w:r>
@@ -2971,74 +3004,79 @@
           <w:p>
             <w:pPr>
               <w:pStyle w:val="Compact"/>
-              <w:jc w:val="center"/>
-            </w:pPr>
-            <w:r>
-              <w:rPr>
-                <w:sz w:val="20"/>
-              </w:rPr>
-              <w:t xml:space="preserve"> </w:t>
-            </w:r>
-          </w:p>
-        </w:tc>
-        <w:tc>
-          <w:tcPr>
-            <w:vAlign w:val="center"/>
-          </w:tcPr>
-          <w:p>
-            <w:pPr>
-              <w:pStyle w:val="Compact"/>
-              <w:jc w:val="center"/>
-            </w:pPr>
-            <w:r>
-              <w:rPr>
-                <w:sz w:val="20"/>
-              </w:rPr>
-              <w:t xml:space="preserve"> </w:t>
-            </w:r>
-          </w:p>
-        </w:tc>
-        <w:tc>
-          <w:tcPr>
-            <w:vAlign w:val="center"/>
-          </w:tcPr>
-          <w:p>
-            <w:pPr>
-              <w:pStyle w:val="Compact"/>
-              <w:jc w:val="center"/>
-            </w:pPr>
-            <w:r>
-              <w:rPr>
-                <w:sz w:val="20"/>
-              </w:rPr>
-              <w:t xml:space="preserve"> </w:t>
-            </w:r>
-          </w:p>
-        </w:tc>
-        <w:tc>
-          <w:tcPr>
-            <w:vAlign w:val="center"/>
-          </w:tcPr>
-          <w:p>
-            <w:pPr>
-              <w:pStyle w:val="Compact"/>
-              <w:jc w:val="center"/>
-            </w:pPr>
-            <w:r>
-              <w:rPr>
-                <w:sz w:val="20"/>
-              </w:rPr>
-              <w:t xml:space="preserve"> </w:t>
-            </w:r>
-          </w:p>
-        </w:tc>
-        <w:tc>
-          <w:tcPr>
-            <w:vAlign w:val="center"/>
-          </w:tcPr>
-          <w:p>
-            <w:pPr>
-              <w:pStyle w:val="Compact"/>
+              <w:keepNext/>
+              <w:jc w:val="center"/>
+            </w:pPr>
+            <w:r>
+              <w:rPr>
+                <w:sz w:val="20"/>
+              </w:rPr>
+              <w:t xml:space="preserve"> </w:t>
+            </w:r>
+          </w:p>
+        </w:tc>
+        <w:tc>
+          <w:tcPr>
+            <w:vAlign w:val="center"/>
+          </w:tcPr>
+          <w:p>
+            <w:pPr>
+              <w:pStyle w:val="Compact"/>
+              <w:keepNext/>
+              <w:jc w:val="center"/>
+            </w:pPr>
+            <w:r>
+              <w:rPr>
+                <w:sz w:val="20"/>
+              </w:rPr>
+              <w:t xml:space="preserve"> </w:t>
+            </w:r>
+          </w:p>
+        </w:tc>
+        <w:tc>
+          <w:tcPr>
+            <w:vAlign w:val="center"/>
+          </w:tcPr>
+          <w:p>
+            <w:pPr>
+              <w:pStyle w:val="Compact"/>
+              <w:keepNext/>
+              <w:jc w:val="center"/>
+            </w:pPr>
+            <w:r>
+              <w:rPr>
+                <w:sz w:val="20"/>
+              </w:rPr>
+              <w:t xml:space="preserve"> </w:t>
+            </w:r>
+          </w:p>
+        </w:tc>
+        <w:tc>
+          <w:tcPr>
+            <w:vAlign w:val="center"/>
+          </w:tcPr>
+          <w:p>
+            <w:pPr>
+              <w:pStyle w:val="Compact"/>
+              <w:keepNext/>
+              <w:jc w:val="center"/>
+            </w:pPr>
+            <w:r>
+              <w:rPr>
+                <w:sz w:val="20"/>
+              </w:rPr>
+              <w:t xml:space="preserve"> </w:t>
+            </w:r>
+          </w:p>
+        </w:tc>
+        <w:tc>
+          <w:tcPr>
+            <w:vAlign w:val="center"/>
+          </w:tcPr>
+          <w:p>
+            <w:pPr>
+              <w:pStyle w:val="Compact"/>
+              <w:keepNext/>
               <w:jc w:val="center"/>
             </w:pPr>
             <w:r>
@@ -3061,74 +3099,79 @@
           <w:p>
             <w:pPr>
               <w:pStyle w:val="Compact"/>
-              <w:jc w:val="center"/>
-            </w:pPr>
-            <w:r>
-              <w:rPr>
-                <w:sz w:val="20"/>
-              </w:rPr>
-              <w:t xml:space="preserve"> </w:t>
-            </w:r>
-          </w:p>
-        </w:tc>
-        <w:tc>
-          <w:tcPr>
-            <w:vAlign w:val="center"/>
-          </w:tcPr>
-          <w:p>
-            <w:pPr>
-              <w:pStyle w:val="Compact"/>
-              <w:jc w:val="center"/>
-            </w:pPr>
-            <w:r>
-              <w:rPr>
-                <w:sz w:val="20"/>
-              </w:rPr>
-              <w:t xml:space="preserve"> </w:t>
-            </w:r>
-          </w:p>
-        </w:tc>
-        <w:tc>
-          <w:tcPr>
-            <w:vAlign w:val="center"/>
-          </w:tcPr>
-          <w:p>
-            <w:pPr>
-              <w:pStyle w:val="Compact"/>
-              <w:jc w:val="center"/>
-            </w:pPr>
-            <w:r>
-              <w:rPr>
-                <w:sz w:val="20"/>
-              </w:rPr>
-              <w:t xml:space="preserve"> </w:t>
-            </w:r>
-          </w:p>
-        </w:tc>
-        <w:tc>
-          <w:tcPr>
-            <w:vAlign w:val="center"/>
-          </w:tcPr>
-          <w:p>
-            <w:pPr>
-              <w:pStyle w:val="Compact"/>
-              <w:jc w:val="center"/>
-            </w:pPr>
-            <w:r>
-              <w:rPr>
-                <w:sz w:val="20"/>
-              </w:rPr>
-              <w:t xml:space="preserve"> </w:t>
-            </w:r>
-          </w:p>
-        </w:tc>
-        <w:tc>
-          <w:tcPr>
-            <w:vAlign w:val="center"/>
-          </w:tcPr>
-          <w:p>
-            <w:pPr>
-              <w:pStyle w:val="Compact"/>
+              <w:keepNext/>
+              <w:jc w:val="center"/>
+            </w:pPr>
+            <w:r>
+              <w:rPr>
+                <w:sz w:val="20"/>
+              </w:rPr>
+              <w:t xml:space="preserve"> </w:t>
+            </w:r>
+          </w:p>
+        </w:tc>
+        <w:tc>
+          <w:tcPr>
+            <w:vAlign w:val="center"/>
+          </w:tcPr>
+          <w:p>
+            <w:pPr>
+              <w:pStyle w:val="Compact"/>
+              <w:keepNext/>
+              <w:jc w:val="center"/>
+            </w:pPr>
+            <w:r>
+              <w:rPr>
+                <w:sz w:val="20"/>
+              </w:rPr>
+              <w:t xml:space="preserve"> </w:t>
+            </w:r>
+          </w:p>
+        </w:tc>
+        <w:tc>
+          <w:tcPr>
+            <w:vAlign w:val="center"/>
+          </w:tcPr>
+          <w:p>
+            <w:pPr>
+              <w:pStyle w:val="Compact"/>
+              <w:keepNext/>
+              <w:jc w:val="center"/>
+            </w:pPr>
+            <w:r>
+              <w:rPr>
+                <w:sz w:val="20"/>
+              </w:rPr>
+              <w:t xml:space="preserve"> </w:t>
+            </w:r>
+          </w:p>
+        </w:tc>
+        <w:tc>
+          <w:tcPr>
+            <w:vAlign w:val="center"/>
+          </w:tcPr>
+          <w:p>
+            <w:pPr>
+              <w:pStyle w:val="Compact"/>
+              <w:keepNext/>
+              <w:jc w:val="center"/>
+            </w:pPr>
+            <w:r>
+              <w:rPr>
+                <w:sz w:val="20"/>
+              </w:rPr>
+              <w:t xml:space="preserve"> </w:t>
+            </w:r>
+          </w:p>
+        </w:tc>
+        <w:tc>
+          <w:tcPr>
+            <w:vAlign w:val="center"/>
+          </w:tcPr>
+          <w:p>
+            <w:pPr>
+              <w:pStyle w:val="Compact"/>
+              <w:keepNext/>
               <w:jc w:val="center"/>
             </w:pPr>
             <w:r>
@@ -3151,74 +3194,79 @@
           <w:p>
             <w:pPr>
               <w:pStyle w:val="Compact"/>
-              <w:jc w:val="center"/>
-            </w:pPr>
-            <w:r>
-              <w:rPr>
-                <w:sz w:val="20"/>
-              </w:rPr>
-              <w:t xml:space="preserve"> </w:t>
-            </w:r>
-          </w:p>
-        </w:tc>
-        <w:tc>
-          <w:tcPr>
-            <w:vAlign w:val="center"/>
-          </w:tcPr>
-          <w:p>
-            <w:pPr>
-              <w:pStyle w:val="Compact"/>
-              <w:jc w:val="center"/>
-            </w:pPr>
-            <w:r>
-              <w:rPr>
-                <w:sz w:val="20"/>
-              </w:rPr>
-              <w:t xml:space="preserve"> </w:t>
-            </w:r>
-          </w:p>
-        </w:tc>
-        <w:tc>
-          <w:tcPr>
-            <w:vAlign w:val="center"/>
-          </w:tcPr>
-          <w:p>
-            <w:pPr>
-              <w:pStyle w:val="Compact"/>
-              <w:jc w:val="center"/>
-            </w:pPr>
-            <w:r>
-              <w:rPr>
-                <w:sz w:val="20"/>
-              </w:rPr>
-              <w:t xml:space="preserve"> </w:t>
-            </w:r>
-          </w:p>
-        </w:tc>
-        <w:tc>
-          <w:tcPr>
-            <w:vAlign w:val="center"/>
-          </w:tcPr>
-          <w:p>
-            <w:pPr>
-              <w:pStyle w:val="Compact"/>
-              <w:jc w:val="center"/>
-            </w:pPr>
-            <w:r>
-              <w:rPr>
-                <w:sz w:val="20"/>
-              </w:rPr>
-              <w:t xml:space="preserve"> </w:t>
-            </w:r>
-          </w:p>
-        </w:tc>
-        <w:tc>
-          <w:tcPr>
-            <w:vAlign w:val="center"/>
-          </w:tcPr>
-          <w:p>
-            <w:pPr>
-              <w:pStyle w:val="Compact"/>
+              <w:keepNext/>
+              <w:jc w:val="center"/>
+            </w:pPr>
+            <w:r>
+              <w:rPr>
+                <w:sz w:val="20"/>
+              </w:rPr>
+              <w:t xml:space="preserve"> </w:t>
+            </w:r>
+          </w:p>
+        </w:tc>
+        <w:tc>
+          <w:tcPr>
+            <w:vAlign w:val="center"/>
+          </w:tcPr>
+          <w:p>
+            <w:pPr>
+              <w:pStyle w:val="Compact"/>
+              <w:keepNext/>
+              <w:jc w:val="center"/>
+            </w:pPr>
+            <w:r>
+              <w:rPr>
+                <w:sz w:val="20"/>
+              </w:rPr>
+              <w:t xml:space="preserve"> </w:t>
+            </w:r>
+          </w:p>
+        </w:tc>
+        <w:tc>
+          <w:tcPr>
+            <w:vAlign w:val="center"/>
+          </w:tcPr>
+          <w:p>
+            <w:pPr>
+              <w:pStyle w:val="Compact"/>
+              <w:keepNext/>
+              <w:jc w:val="center"/>
+            </w:pPr>
+            <w:r>
+              <w:rPr>
+                <w:sz w:val="20"/>
+              </w:rPr>
+              <w:t xml:space="preserve"> </w:t>
+            </w:r>
+          </w:p>
+        </w:tc>
+        <w:tc>
+          <w:tcPr>
+            <w:vAlign w:val="center"/>
+          </w:tcPr>
+          <w:p>
+            <w:pPr>
+              <w:pStyle w:val="Compact"/>
+              <w:keepNext/>
+              <w:jc w:val="center"/>
+            </w:pPr>
+            <w:r>
+              <w:rPr>
+                <w:sz w:val="20"/>
+              </w:rPr>
+              <w:t xml:space="preserve"> </w:t>
+            </w:r>
+          </w:p>
+        </w:tc>
+        <w:tc>
+          <w:tcPr>
+            <w:vAlign w:val="center"/>
+          </w:tcPr>
+          <w:p>
+            <w:pPr>
+              <w:pStyle w:val="Compact"/>
+              <w:keepNext/>
               <w:jc w:val="center"/>
             </w:pPr>
             <w:r>
@@ -3241,74 +3289,79 @@
           <w:p>
             <w:pPr>
               <w:pStyle w:val="Compact"/>
-              <w:jc w:val="center"/>
-            </w:pPr>
-            <w:r>
-              <w:rPr>
-                <w:sz w:val="20"/>
-              </w:rPr>
-              <w:t xml:space="preserve"> </w:t>
-            </w:r>
-          </w:p>
-        </w:tc>
-        <w:tc>
-          <w:tcPr>
-            <w:vAlign w:val="center"/>
-          </w:tcPr>
-          <w:p>
-            <w:pPr>
-              <w:pStyle w:val="Compact"/>
-              <w:jc w:val="center"/>
-            </w:pPr>
-            <w:r>
-              <w:rPr>
-                <w:sz w:val="20"/>
-              </w:rPr>
-              <w:t xml:space="preserve"> </w:t>
-            </w:r>
-          </w:p>
-        </w:tc>
-        <w:tc>
-          <w:tcPr>
-            <w:vAlign w:val="center"/>
-          </w:tcPr>
-          <w:p>
-            <w:pPr>
-              <w:pStyle w:val="Compact"/>
-              <w:jc w:val="center"/>
-            </w:pPr>
-            <w:r>
-              <w:rPr>
-                <w:sz w:val="20"/>
-              </w:rPr>
-              <w:t xml:space="preserve"> </w:t>
-            </w:r>
-          </w:p>
-        </w:tc>
-        <w:tc>
-          <w:tcPr>
-            <w:vAlign w:val="center"/>
-          </w:tcPr>
-          <w:p>
-            <w:pPr>
-              <w:pStyle w:val="Compact"/>
-              <w:jc w:val="center"/>
-            </w:pPr>
-            <w:r>
-              <w:rPr>
-                <w:sz w:val="20"/>
-              </w:rPr>
-              <w:t xml:space="preserve"> </w:t>
-            </w:r>
-          </w:p>
-        </w:tc>
-        <w:tc>
-          <w:tcPr>
-            <w:vAlign w:val="center"/>
-          </w:tcPr>
-          <w:p>
-            <w:pPr>
-              <w:pStyle w:val="Compact"/>
+              <w:keepNext/>
+              <w:jc w:val="center"/>
+            </w:pPr>
+            <w:r>
+              <w:rPr>
+                <w:sz w:val="20"/>
+              </w:rPr>
+              <w:t xml:space="preserve"> </w:t>
+            </w:r>
+          </w:p>
+        </w:tc>
+        <w:tc>
+          <w:tcPr>
+            <w:vAlign w:val="center"/>
+          </w:tcPr>
+          <w:p>
+            <w:pPr>
+              <w:pStyle w:val="Compact"/>
+              <w:keepNext/>
+              <w:jc w:val="center"/>
+            </w:pPr>
+            <w:r>
+              <w:rPr>
+                <w:sz w:val="20"/>
+              </w:rPr>
+              <w:t xml:space="preserve"> </w:t>
+            </w:r>
+          </w:p>
+        </w:tc>
+        <w:tc>
+          <w:tcPr>
+            <w:vAlign w:val="center"/>
+          </w:tcPr>
+          <w:p>
+            <w:pPr>
+              <w:pStyle w:val="Compact"/>
+              <w:keepNext/>
+              <w:jc w:val="center"/>
+            </w:pPr>
+            <w:r>
+              <w:rPr>
+                <w:sz w:val="20"/>
+              </w:rPr>
+              <w:t xml:space="preserve"> </w:t>
+            </w:r>
+          </w:p>
+        </w:tc>
+        <w:tc>
+          <w:tcPr>
+            <w:vAlign w:val="center"/>
+          </w:tcPr>
+          <w:p>
+            <w:pPr>
+              <w:pStyle w:val="Compact"/>
+              <w:keepNext/>
+              <w:jc w:val="center"/>
+            </w:pPr>
+            <w:r>
+              <w:rPr>
+                <w:sz w:val="20"/>
+              </w:rPr>
+              <w:t xml:space="preserve"> </w:t>
+            </w:r>
+          </w:p>
+        </w:tc>
+        <w:tc>
+          <w:tcPr>
+            <w:vAlign w:val="center"/>
+          </w:tcPr>
+          <w:p>
+            <w:pPr>
+              <w:pStyle w:val="Compact"/>
+              <w:keepNext/>
               <w:jc w:val="center"/>
             </w:pPr>
             <w:r>
@@ -3461,65 +3514,70 @@
         <w:t xml:space="preserve"> </w:t>
       </w:r>
       <w:r>
-        <w:t xml:space="preserve">Con la pendiente</w:t>
+        <w:t xml:space="preserve">A partir del ajuste</w:t>
       </w:r>
       <w:r>
         <w:t xml:space="preserve"> </w:t>
       </w:r>
       <m:oMath>
-        <m:r>
-          <m:t>B</m:t>
-        </m:r>
-      </m:oMath>
-      <w:r>
-        <w:t xml:space="preserve"> </w:t>
-      </w:r>
-      <w:r>
-        <w:t xml:space="preserve">del ajuste, obtenga</w:t>
-      </w:r>
-      <w:r>
-        <w:t xml:space="preserve"> </w:t>
-      </w:r>
-      <m:oMath>
-        <m:r>
-          <m:t>g</m:t>
-        </m:r>
-        <m:r>
-          <m:rPr>
-            <m:sty m:val="p"/>
-          </m:rPr>
-          <m:t>=</m:t>
-        </m:r>
-        <m:r>
-          <m:t>4</m:t>
-        </m:r>
-        <m:sSup>
+        <m:sSubSup>
           <m:e>
             <m:r>
-              <m:t>π</m:t>
+              <m:t>T</m:t>
             </m:r>
           </m:e>
+          <m:sub>
+            <m:r>
+              <m:t>0</m:t>
+            </m:r>
+          </m:sub>
           <m:sup>
             <m:r>
               <m:t>2</m:t>
             </m:r>
           </m:sup>
-        </m:sSup>
+        </m:sSubSup>
         <m:r>
           <m:rPr>
             <m:sty m:val="p"/>
           </m:rPr>
-          <m:t>/</m:t>
+          <m:t>=</m:t>
         </m:r>
         <m:r>
           <m:t>B</m:t>
         </m:r>
+        <m:r>
+          <m:t> </m:t>
+        </m:r>
+        <m:r>
+          <m:t>L</m:t>
+        </m:r>
+        <m:r>
+          <m:rPr>
+            <m:sty m:val="p"/>
+          </m:rPr>
+          <m:t>+</m:t>
+        </m:r>
+        <m:r>
+          <m:t>A</m:t>
+        </m:r>
       </m:oMath>
       <w:r>
-        <w:t xml:space="preserve"> </w:t>
-      </w:r>
-      <w:r>
-        <w:t xml:space="preserve">con su error y compárelo con 9,81 m/s².</w:t>
+        <w:t xml:space="preserve">, obtenga</w:t>
+      </w:r>
+      <w:r>
+        <w:t xml:space="preserve"> </w:t>
+      </w:r>
+      <m:oMath>
+        <m:r>
+          <m:t>g</m:t>
+        </m:r>
+      </m:oMath>
+      <w:r>
+        <w:t xml:space="preserve"> </w:t>
+      </w:r>
+      <w:r>
+        <w:t xml:space="preserve">con su error.</w:t>
       </w:r>
     </w:p>
     <w:p>

</xml_diff>

<commit_message>
Fichas P1-P4: una ecuación por línea, más espacio; Hooke solo dinámica
Co-Authored-By: Claude Opus 5.5 <noreply@anthropic.com>
Claude-Session: https://claude.ai/code/session_01GdrGkTkQ1SpY6BWmf3EBwF
</commit_message>
<xml_diff>
--- a/fichas/fai-pendulo-simple.docx
+++ b/fichas/fai-pendulo-simple.docx
@@ -113,8 +113,7 @@
     <w:p>
       <w:pPr>
         <w:pStyle w:val="BodyText"/>
-        <w:spacing w:after="120" w:line="276" w:lineRule="auto"/>
-        <w:jc w:val="both"/>
+        <w:spacing w:before="200" w:after="200"/>
       </w:pPr>
       <m:oMathPara>
         <m:oMathParaPr>
@@ -317,8 +316,7 @@
     <w:p>
       <w:pPr>
         <w:pStyle w:val="BodyText"/>
-        <w:spacing w:after="120" w:line="276" w:lineRule="auto"/>
-        <w:jc w:val="both"/>
+        <w:spacing w:before="200" w:after="200"/>
       </w:pPr>
       <m:oMathPara>
         <m:oMathParaPr>
@@ -394,8 +392,7 @@
     <w:p>
       <w:pPr>
         <w:pStyle w:val="BodyText"/>
-        <w:spacing w:after="120" w:line="276" w:lineRule="auto"/>
-        <w:jc w:val="both"/>
+        <w:spacing w:before="200" w:after="200"/>
       </w:pPr>
       <m:oMathPara>
         <m:oMathParaPr>
@@ -595,8 +592,7 @@
     <w:p>
       <w:pPr>
         <w:pStyle w:val="BodyText"/>
-        <w:spacing w:after="120" w:line="276" w:lineRule="auto"/>
-        <w:jc w:val="both"/>
+        <w:spacing w:before="200" w:after="200"/>
       </w:pPr>
       <m:oMathPara>
         <m:oMathParaPr>
@@ -840,6 +836,7 @@
     <w:p>
       <w:pPr>
         <w:pStyle w:val="ImageCaption"/>
+        <w:spacing w:after="280"/>
         <w:jc w:val="center"/>
       </w:pPr>
       <w:r>
@@ -957,7 +954,7 @@
       <w:pPr>
         <w:pStyle w:val="TableCaption"/>
         <w:keepNext/>
-        <w:spacing w:before="200" w:after="80"/>
+        <w:spacing w:after="80" w:before="200"/>
         <w:jc w:val="center"/>
       </w:pPr>
       <w:r>
@@ -2560,7 +2557,7 @@
       <w:pPr>
         <w:pStyle w:val="TableCaption"/>
         <w:keepNext/>
-        <w:spacing w:before="200" w:after="80"/>
+        <w:spacing w:after="80" w:before="200"/>
         <w:jc w:val="center"/>
       </w:pPr>
       <w:r>
@@ -3653,7 +3650,7 @@
       <w:pPr>
         <w:pStyle w:val="TableCaption"/>
         <w:keepNext/>
-        <w:spacing w:before="200" w:after="80"/>
+        <w:spacing w:after="80" w:before="200"/>
         <w:jc w:val="center"/>
       </w:pPr>
       <w:r>
@@ -4169,7 +4166,7 @@
       <w:pPr>
         <w:pStyle w:val="TableCaption"/>
         <w:keepNext/>
-        <w:spacing w:before="200" w:after="80"/>
+        <w:spacing w:after="80" w:before="200"/>
         <w:jc w:val="center"/>
       </w:pPr>
       <w:r>

</xml_diff>